<commit_message>
Messages en cours de séance : ENT-2.1, le retour et la casse arrivent après le premier compte rendu à Nadia
- core/declencheurs.js : conditions réutilisables apresMail, apresJalon, tous
  (ligne et nombres déplacées d'ENT-2.1, réimportées par ENT-2.1 et ENT-2.3)
- entreprise.js : un envoi qui fait arriver un message affiche les deux dans la bulle
- ENT-2.1 : 2 mails à l'ouverture, consigne de Nadia en deux temps, étape d'accueil ajoutée
- trame et corrigé régénérés ; tests cdiscount (3 cas nouveaux, 3 réécrits), suite 368/368

Co-Authored-By: Claude Opus 5.5 <noreply@anthropic.com>
</commit_message>
<xml_diff>
--- a/contenus/trames/ENT-2.1-cdiscount-mouvements-trame-eleve.docx
+++ b/contenus/trames/ENT-2.1-cdiscount-mouvements-trame-eleve.docx
@@ -1407,7 +1407,7 @@
         <w:rPr>
           <w:sz w:val="22"/>
         </w:rPr>
-        <w:t>Ouvre ensuite « Écouteurs ECO-BT-01 : racontez-moi la semaine ». Lis-le en entier, jusqu'au bout. Ne réponds pas tout de suite : tu répondras à l'étape 7.</w:t>
+        <w:t>Ouvre ensuite « Écouteurs ECO-BT-01 : racontez-moi la semaine ». Lis-le en entier, jusqu'au bout. Ne réponds pas tout de suite : tu enverras ton stock actuel à la fin de l'étape 3, et ta réponse complète à l'étape 7.</w:t>
       </w:r>
     </w:p>
     <w:p>
@@ -2027,6 +2027,104 @@
                 <w:sz w:val="20"/>
               </w:rPr>
               <w:t>sur l'écran Stock, des cases de chiffres en haut, puis la liste des références ; dans la console, une réponse avec la référence et la quantité. Les deux nombres doivent être identiques. Sinon, vérifie que tu as bien écrit la référence.</w:t>
+            </w:r>
+          </w:p>
+        </w:tc>
+      </w:tr>
+    </w:tbl>
+    <w:p>
+      <w:pPr>
+        <w:spacing w:after="40"/>
+      </w:pPr>
+    </w:p>
+    <w:p>
+      <w:pPr>
+        <w:spacing w:before="0" w:after="120"/>
+      </w:pPr>
+      <w:r>
+        <w:rPr>
+          <w:b w:val="0"/>
+          <w:color w:val="1A1A1A"/>
+          <w:sz w:val="22"/>
+        </w:rPr>
+        <w:t>Nadia attend ce premier chiffre avant la suite : envoie-le-lui maintenant.</w:t>
+      </w:r>
+    </w:p>
+    <w:p>
+      <w:pPr>
+        <w:keepNext/>
+        <w:spacing w:after="80"/>
+        <w:ind w:left="454" w:hanging="454"/>
+      </w:pPr>
+      <w:r>
+        <w:rPr>
+          <w:b/>
+          <w:color w:val="111111"/>
+          <w:sz w:val="22"/>
+        </w:rPr>
+        <w:t xml:space="preserve">1.  </w:t>
+      </w:r>
+      <w:r>
+        <w:rPr>
+          <w:sz w:val="22"/>
+        </w:rPr>
+        <w:t>Dans « Messagerie », ouvre le message de Nadia et clique sur « Répondre ».</w:t>
+      </w:r>
+    </w:p>
+    <w:p>
+      <w:pPr>
+        <w:keepNext/>
+        <w:spacing w:after="80"/>
+        <w:ind w:left="454" w:hanging="454"/>
+      </w:pPr>
+      <w:r>
+        <w:rPr>
+          <w:b/>
+          <w:color w:val="111111"/>
+          <w:sz w:val="22"/>
+        </w:rPr>
+        <w:t xml:space="preserve">2.  </w:t>
+      </w:r>
+      <w:r>
+        <w:rPr>
+          <w:sz w:val="22"/>
+        </w:rPr>
+        <w:t>Complète seulement la première ligne (« Stock actuel : ») avec le nombre que tu as relevé, puis clique sur « Envoyer ».</w:t>
+      </w:r>
+    </w:p>
+    <w:tbl>
+      <w:tblPr>
+        <w:tblStyle w:val="TableGrid"/>
+        <w:tblW w:type="auto" w:w="0"/>
+        <w:jc w:val="left"/>
+        <w:tblLook w:firstColumn="1" w:firstRow="1" w:lastColumn="0" w:lastRow="0" w:noHBand="0" w:noVBand="1" w:val="04A0"/>
+      </w:tblPr>
+      <w:tblGrid>
+        <w:gridCol w:w="10086"/>
+      </w:tblGrid>
+      <w:tr>
+        <w:tc>
+          <w:tcPr>
+            <w:tcW w:type="dxa" w:w="10086"/>
+            <w:shd w:fill="F2F2F2"/>
+          </w:tcPr>
+          <w:p>
+            <w:pPr>
+              <w:spacing w:after="0"/>
+            </w:pPr>
+            <w:r>
+              <w:rPr>
+                <w:b/>
+                <w:color w:val="111111"/>
+                <w:sz w:val="20"/>
+              </w:rPr>
+              <w:t xml:space="preserve">Ce que tu dois voir : </w:t>
+            </w:r>
+            <w:r>
+              <w:rPr>
+                <w:sz w:val="20"/>
+              </w:rPr>
+              <w:t>en bas de l'écran, « Réponse envoyée. Nouveau message » ; à côté de « Messagerie », le nombre de messages non lus augmente. Ces nouveaux messages te serviront à l'étape 5.</w:t>
             </w:r>
           </w:p>
         </w:tc>
@@ -5177,7 +5275,7 @@
           <w:color w:val="1A1A1A"/>
           <w:sz w:val="22"/>
         </w:rPr>
-        <w:t>Tu as tout ce qu'il faut. Il reste à répondre à Nadia comme elle le demande : six lignes, une information par ligne.</w:t>
+        <w:t>Tu as tout ce qu'il faut. Il reste à envoyer à Nadia la réponse complète : six lignes, une information par ligne.</w:t>
       </w:r>
     </w:p>
     <w:tbl>

</xml_diff>

<commit_message>
Cdiscount : trames élève ENT-2.1 (refaite), 2.2, 2.3, 2.4, 2.6 et leurs corrigés (non déclarées)
Co-Authored-By: Claude Opus 5.5 <noreply@anthropic.com>
</commit_message>
<xml_diff>
--- a/contenus/trames/ENT-2.1-cdiscount-mouvements-trame-eleve.docx
+++ b/contenus/trames/ENT-2.1-cdiscount-mouvements-trame-eleve.docx
@@ -300,7 +300,7 @@
               <w:rPr>
                 <w:sz w:val="20"/>
               </w:rPr>
-              <w:t>tu peux le suivre seul, étape par étape. Chaque étape dit où cliquer et ce que tu dois voir à l'écran. Les réponses à Nadia Ferrand, ta cheffe d'équipe, ne sont jamais données ici : tu les trouves dans le logiciel.</w:t>
+              <w:t>tu peux le suivre seul, étape par étape. Chaque étape dit où cliquer et ce que tu dois voir à l'écran.</w:t>
             </w:r>
           </w:p>
         </w:tc>
@@ -344,7 +344,51 @@
               <w:rPr>
                 <w:sz w:val="20"/>
               </w:rPr>
-              <w:t>cinq points, lus dans ta réponse écrite à Nadia (étape 7) : le stock actuel, la réception, les commandes, les autres documents et le stock du dernier inventaire. Le logiciel ne te dit pas, pendant l'exercice, si c'est juste : ce sont les deux vérifications de la fiche de stock (étapes 4 et 6) qui te permettent de te contrôler. Tes réponses écrites dans cette trame ne sont pas notées par le logiciel : elles servent à réfléchir.</w:t>
+              <w:t>six points, lus dans la réponse que tu envoies à ta cheffe d'équipe. Le logiciel ne te dit pas pendant la séance si tes réponses sont justes. Tes réponses écrites ici servent à réfléchir et à préparer ce message.</w:t>
+            </w:r>
+          </w:p>
+        </w:tc>
+      </w:tr>
+    </w:tbl>
+    <w:p>
+      <w:pPr>
+        <w:keepNext/>
+        <w:spacing w:after="40"/>
+      </w:pPr>
+    </w:p>
+    <w:tbl>
+      <w:tblPr>
+        <w:tblStyle w:val="TableGrid"/>
+        <w:tblW w:type="auto" w:w="0"/>
+        <w:jc w:val="left"/>
+        <w:tblLook w:firstColumn="1" w:firstRow="1" w:lastColumn="0" w:lastRow="0" w:noHBand="0" w:noVBand="1" w:val="04A0"/>
+      </w:tblPr>
+      <w:tblGrid>
+        <w:gridCol w:w="10086"/>
+      </w:tblGrid>
+      <w:tr>
+        <w:tc>
+          <w:tcPr>
+            <w:tcW w:type="dxa" w:w="10086"/>
+            <w:shd w:fill="F2F2F2"/>
+          </w:tcPr>
+          <w:p>
+            <w:pPr>
+              <w:spacing w:after="0"/>
+            </w:pPr>
+            <w:r>
+              <w:rPr>
+                <w:b/>
+                <w:color w:val="111111"/>
+                <w:sz w:val="20"/>
+              </w:rPr>
+              <w:t xml:space="preserve">Ce qui est vrai, ce qui est construit : </w:t>
+            </w:r>
+            <w:r>
+              <w:rPr>
+                <w:sz w:val="20"/>
+              </w:rPr>
+              <w:t>Cdiscount, son entrepôt de Cestas, sa filiale logistique, son logo et ses couleurs sont réels. Le reste est construit pour l'exercice : la cliente et sa commande, les articles et leurs marques, les fournisseurs, les numéros de documents, les quantités et les personnes de l'équipe. Le vrai entrepôt est bien plus grand : tu n'en vois qu'un rayon de petits articles.</w:t>
             </w:r>
           </w:p>
         </w:tc>
@@ -542,7 +586,7 @@
               <w:rPr>
                 <w:sz w:val="20"/>
               </w:rPr>
-              <w:t>Ouvrir son environnement et lire le message de Nadia</w:t>
+              <w:t>Lire la messagerie : le problème de ce matin</w:t>
             </w:r>
           </w:p>
         </w:tc>
@@ -595,7 +639,7 @@
               <w:rPr>
                 <w:sz w:val="20"/>
               </w:rPr>
-              <w:t>Relever le stock actuel</w:t>
+              <w:t>Relever le stock actuel et l'envoyer</w:t>
             </w:r>
           </w:p>
         </w:tc>
@@ -648,7 +692,7 @@
               <w:rPr>
                 <w:sz w:val="20"/>
               </w:rPr>
-              <w:t>Lister les mouvements et remplir la fiche de stock</w:t>
+              <w:t>Lister les mouvements sur une fiche de stock</w:t>
             </w:r>
           </w:p>
         </w:tc>
@@ -664,7 +708,7 @@
               <w:rPr>
                 <w:sz w:val="20"/>
               </w:rPr>
-              <w:t>Dans Prepalog, puis sur ta fiche</w:t>
+              <w:t>Dans Prepalog</w:t>
             </w:r>
           </w:p>
         </w:tc>
@@ -754,7 +798,7 @@
               <w:rPr>
                 <w:sz w:val="20"/>
               </w:rPr>
-              <w:t>Refaire le calcul à l'envers</w:t>
+              <w:t>Comparer chaque document à son mouvement</w:t>
             </w:r>
           </w:p>
         </w:tc>
@@ -770,7 +814,7 @@
               <w:rPr>
                 <w:sz w:val="20"/>
               </w:rPr>
-              <w:t>Sur ta fiche</w:t>
+              <w:t>Dans Prepalog</w:t>
             </w:r>
           </w:p>
         </w:tc>
@@ -792,6 +836,59 @@
                 <w:sz w:val="20"/>
               </w:rPr>
               <w:t>7</w:t>
+            </w:r>
+          </w:p>
+        </w:tc>
+        <w:tc>
+          <w:tcPr>
+            <w:tcW w:type="dxa" w:w="6236"/>
+          </w:tcPr>
+          <w:p>
+            <w:pPr>
+              <w:spacing w:after="0"/>
+            </w:pPr>
+            <w:r>
+              <w:rPr>
+                <w:sz w:val="20"/>
+              </w:rPr>
+              <w:t>Refaire le calcul à l'envers</w:t>
+            </w:r>
+          </w:p>
+        </w:tc>
+        <w:tc>
+          <w:tcPr>
+            <w:tcW w:type="dxa" w:w="2608"/>
+          </w:tcPr>
+          <w:p>
+            <w:pPr>
+              <w:spacing w:after="0"/>
+            </w:pPr>
+            <w:r>
+              <w:rPr>
+                <w:sz w:val="20"/>
+              </w:rPr>
+              <w:t>Dans Prepalog</w:t>
+            </w:r>
+          </w:p>
+        </w:tc>
+      </w:tr>
+      <w:tr>
+        <w:trPr>
+          <w:trHeight w:val="510"/>
+        </w:trPr>
+        <w:tc>
+          <w:tcPr>
+            <w:tcW w:type="dxa" w:w="794"/>
+          </w:tcPr>
+          <w:p>
+            <w:pPr>
+              <w:spacing w:after="0"/>
+            </w:pPr>
+            <w:r>
+              <w:rPr>
+                <w:sz w:val="20"/>
+              </w:rPr>
+              <w:t>8</w:t>
             </w:r>
           </w:p>
         </w:tc>
@@ -874,7 +971,7 @@
           <w:color w:val="1A1A1A"/>
           <w:sz w:val="22"/>
         </w:rPr>
-        <w:t>Avant d'ouvrir le logiciel, il faut savoir pour qui tu travailles. Cdiscount existe vraiment. Cette séance se passe dans son entrepôt de Cestas, en Gironde. Fais d'abord une recherche sur Internet.</w:t>
+        <w:t>Cette séance se passe dans l'entrepôt de Cdiscount à Cestas, près de Bordeaux. Avant d'ouvrir le logiciel, découvre l'entreprise. Fais une recherche sur Internet.</w:t>
       </w:r>
     </w:p>
     <w:p>
@@ -895,7 +992,7 @@
         <w:rPr>
           <w:sz w:val="22"/>
         </w:rPr>
-        <w:t>Cherche « Cdiscount entreprise » et ouvre une page qui présente la société (par exemple Wikipédia).</w:t>
+        <w:t>Cherche « Cdiscount » et ouvre une page qui présente l'entreprise (par exemple Wikipédia).</w:t>
       </w:r>
     </w:p>
     <w:p>
@@ -916,7 +1013,7 @@
         <w:rPr>
           <w:sz w:val="22"/>
         </w:rPr>
-        <w:t>Cherche ensuite « Cdiscount entrepôt Cestas ».</w:t>
+        <w:t>Cherche ensuite « C-Logistics Cdiscount Cestas » et ouvre un article qui parle de ses entrepôts.</w:t>
       </w:r>
     </w:p>
     <w:p>
@@ -1066,7 +1163,7 @@
               <w:rPr>
                 <w:sz w:val="20"/>
               </w:rPr>
-              <w:t>Dans quel département se trouve son entrepôt de Cestas ?</w:t>
+              <w:t>Quel est le nom de sa filiale logistique ?</w:t>
             </w:r>
           </w:p>
         </w:tc>
@@ -1094,7 +1191,7 @@
               <w:rPr>
                 <w:sz w:val="20"/>
               </w:rPr>
-              <w:t>Quel est le nom de sa filiale logistique ?</w:t>
+              <w:t>Quels produits l'entrepôt de Cestas traite-t-il (quel poids) ?</w:t>
             </w:r>
           </w:p>
         </w:tc>
@@ -1208,18 +1305,23 @@
                 <w:color w:val="111111"/>
                 <w:sz w:val="20"/>
               </w:rPr>
-              <w:t xml:space="preserve">Ce qui est vrai, ce qui est construit : </w:t>
+              <w:t xml:space="preserve">Un mot à connaître : </w:t>
             </w:r>
             <w:r>
               <w:rPr>
                 <w:sz w:val="20"/>
               </w:rPr>
-              <w:t>Cdiscount, son entrepôt de Cestas, sa filiale logistique, son logo et ses couleurs sont réels. Tout le reste est construit pour l'exercice : les articles et leurs marques (elles n'existent pas), les fournisseurs, les clients, les numéros de documents, les quantités et les personnes de l'équipe. Le vrai entrepôt de Cestas est beaucoup plus grand : tu n'en vois qu'un rayon de petits articles.</w:t>
+              <w:t>le Black Friday est une journée de grosses promotions, fin novembre. Pour un site de vente en ligne et ses entrepôts, c'est le début de la période la plus chargée de l'année, jusqu'à Noël.</w:t>
             </w:r>
           </w:p>
         </w:tc>
       </w:tr>
     </w:tbl>
+    <w:p>
+      <w:pPr>
+        <w:spacing w:after="40"/>
+      </w:pPr>
+    </w:p>
     <w:p>
       <w:pPr>
         <w:keepNext/>
@@ -1269,7 +1371,7 @@
                 <w:b/>
                 <w:sz w:val="21"/>
               </w:rPr>
-              <w:t>Pour un site de vente en ligne, pourquoi est-il important que le stock affiché soit le stock réel ?</w:t>
+              <w:t>D'après ce que tu as trouvé, pourquoi une erreur de stock coûte-t-elle plus cher à Cdiscount en novembre qu'en mars ?</w:t>
             </w:r>
           </w:p>
           <w:p>
@@ -1352,7 +1454,7 @@
           <w:color w:val="111111"/>
           <w:sz w:val="30"/>
         </w:rPr>
-        <w:t>Ouvrir son environnement et lire le message de Nadia</w:t>
+        <w:t>Lire la messagerie : le problème de ce matin</w:t>
       </w:r>
     </w:p>
     <w:p>
@@ -1365,7 +1467,7 @@
           <w:color w:val="1A1A1A"/>
           <w:sz w:val="22"/>
         </w:rPr>
-        <w:t>Connecte-toi à Prepalog, ouvre la rubrique Logisim, puis l'activité « Cdiscount — le stock raconte ». Le logiciel s'ouvre aux couleurs de Cdiscount : un bandeau bleu en haut, un menu à gauche. Clique sur « Messagerie » : plusieurs messages t'attendent.</w:t>
+        <w:t>Connecte-toi à Prepalog, ouvre la rubrique Logisim, puis l'activité « Cdiscount — le stock raconte ». Le logiciel s'ouvre aux couleurs de Cdiscount, avec un menu à gauche. L'accueil liste le travail de la séance, dans l'ordre.</w:t>
       </w:r>
     </w:p>
     <w:p>
@@ -1386,7 +1488,7 @@
         <w:rPr>
           <w:sz w:val="22"/>
         </w:rPr>
-        <w:t>Ouvre d'abord « Bienvenue à l'entrepôt de Cestas » : Nadia Ferrand, ta cheffe d'équipe, te présente le travail.</w:t>
+        <w:t>Dans le menu de gauche, clique sur « Messagerie ».</w:t>
       </w:r>
     </w:p>
     <w:p>
@@ -1407,7 +1509,7 @@
         <w:rPr>
           <w:sz w:val="22"/>
         </w:rPr>
-        <w:t>Ouvre ensuite « Écouteurs ECO-BT-01 : racontez-moi la semaine ». Lis-le en entier, jusqu'au bout. Ne réponds pas tout de suite : tu enverras ton stock actuel à la fin de l'étape 3, et ta réponse complète à l'étape 7.</w:t>
+        <w:t>Ouvre d'abord « Bienvenue à l'entrepôt de Cestas ».</w:t>
       </w:r>
     </w:p>
     <w:p>
@@ -1428,52 +1530,29 @@
         <w:rPr>
           <w:sz w:val="22"/>
         </w:rPr>
-        <w:t>Relève les informations ci-dessous.</w:t>
+        <w:t>Ouvre ensuite le message de Nadia Ferrand sur les écouteurs. Lis-le en entier, jusqu'à la signature.</w:t>
       </w:r>
     </w:p>
-    <w:tbl>
-      <w:tblPr>
-        <w:tblStyle w:val="TableGrid"/>
-        <w:tblW w:type="auto" w:w="0"/>
-        <w:jc w:val="left"/>
-        <w:tblLook w:firstColumn="1" w:firstRow="1" w:lastColumn="0" w:lastRow="0" w:noHBand="0" w:noVBand="1" w:val="04A0"/>
-      </w:tblPr>
-      <w:tblGrid>
-        <w:gridCol w:w="10086"/>
-      </w:tblGrid>
-      <w:tr>
-        <w:tc>
-          <w:tcPr>
-            <w:tcW w:type="dxa" w:w="10086"/>
-            <w:shd w:fill="F2F2F2"/>
-          </w:tcPr>
-          <w:p>
-            <w:pPr>
-              <w:spacing w:after="0"/>
-            </w:pPr>
-            <w:r>
-              <w:rPr>
-                <w:b/>
-                <w:color w:val="111111"/>
-                <w:sz w:val="20"/>
-              </w:rPr>
-              <w:t xml:space="preserve">Un mot de métier : </w:t>
-            </w:r>
-            <w:r>
-              <w:rPr>
-                <w:sz w:val="20"/>
-              </w:rPr>
-              <w:t>un inventaire, c'est compter à la main ce qu'il y a vraiment dans les rayons, puis comparer avec le chiffre de l'ordinateur.</w:t>
-            </w:r>
-          </w:p>
-        </w:tc>
-      </w:tr>
-    </w:tbl>
     <w:p>
       <w:pPr>
         <w:keepNext/>
-        <w:spacing w:after="40"/>
+        <w:spacing w:after="80"/>
+        <w:ind w:left="454" w:hanging="454"/>
       </w:pPr>
+      <w:r>
+        <w:rPr>
+          <w:b/>
+          <w:color w:val="111111"/>
+          <w:sz w:val="22"/>
+        </w:rPr>
+        <w:t xml:space="preserve">4.  </w:t>
+      </w:r>
+      <w:r>
+        <w:rPr>
+          <w:sz w:val="22"/>
+        </w:rPr>
+        <w:t>Ne réponds pas encore : tu enverras ton premier chiffre à l'étape 3.</w:t>
+      </w:r>
     </w:p>
     <w:tbl>
       <w:tblPr>
@@ -1571,7 +1650,7 @@
               <w:rPr>
                 <w:sz w:val="20"/>
               </w:rPr>
-              <w:t>Selon le message de bienvenue, le stock affiché dans le système doit être égal à quoi ?</w:t>
+              <w:t>Quelle commande a été annulée ce matin (numéro) ?</w:t>
             </w:r>
           </w:p>
         </w:tc>
@@ -1598,7 +1677,7 @@
               <w:rPr>
                 <w:sz w:val="20"/>
               </w:rPr>
-              <w:t>De quel article parle Nadia (nom et référence) ?</w:t>
+              <w:t>Référence de l'article commandé</w:t>
             </w:r>
           </w:p>
         </w:tc>
@@ -1625,7 +1704,7 @@
               <w:rPr>
                 <w:sz w:val="20"/>
               </w:rPr>
-              <w:t>À quelle date a eu lieu le dernier inventaire ?</w:t>
+              <w:t>Ce que le préparateur a trouvé à l'emplacement</w:t>
             </w:r>
           </w:p>
         </w:tc>
@@ -1652,7 +1731,7 @@
               <w:rPr>
                 <w:sz w:val="20"/>
               </w:rPr>
-              <w:t>Combien de lignes doit contenir ta réponse ?</w:t>
+              <w:t>Combien d'articles le système dit-il qu'il en reste ?</w:t>
             </w:r>
           </w:p>
         </w:tc>
@@ -1661,6 +1740,127 @@
             <w:tcW w:type="dxa" w:w="4762"/>
           </w:tcPr>
           <w:p/>
+        </w:tc>
+      </w:tr>
+      <w:tr>
+        <w:trPr>
+          <w:trHeight w:val="567"/>
+        </w:trPr>
+        <w:tc>
+          <w:tcPr>
+            <w:tcW w:type="dxa" w:w="4876"/>
+          </w:tcPr>
+          <w:p>
+            <w:pPr>
+              <w:spacing w:after="0"/>
+            </w:pPr>
+            <w:r>
+              <w:rPr>
+                <w:sz w:val="20"/>
+              </w:rPr>
+              <w:t>Date du dernier inventaire de l'allée</w:t>
+            </w:r>
+          </w:p>
+        </w:tc>
+        <w:tc>
+          <w:tcPr>
+            <w:tcW w:type="dxa" w:w="4762"/>
+          </w:tcPr>
+          <w:p/>
+        </w:tc>
+      </w:tr>
+      <w:tr>
+        <w:trPr>
+          <w:trHeight w:val="567"/>
+        </w:trPr>
+        <w:tc>
+          <w:tcPr>
+            <w:tcW w:type="dxa" w:w="4876"/>
+          </w:tcPr>
+          <w:p>
+            <w:pPr>
+              <w:spacing w:after="0"/>
+            </w:pPr>
+            <w:r>
+              <w:rPr>
+                <w:sz w:val="20"/>
+              </w:rPr>
+              <w:t>Combien de lignes doit contenir ta réponse complète ?</w:t>
+            </w:r>
+          </w:p>
+        </w:tc>
+        <w:tc>
+          <w:tcPr>
+            <w:tcW w:type="dxa" w:w="4762"/>
+          </w:tcPr>
+          <w:p/>
+        </w:tc>
+      </w:tr>
+    </w:tbl>
+    <w:p>
+      <w:pPr>
+        <w:keepNext/>
+        <w:spacing w:after="40"/>
+      </w:pPr>
+    </w:p>
+    <w:tbl>
+      <w:tblPr>
+        <w:tblStyle w:val="TableGrid"/>
+        <w:tblW w:type="auto" w:w="0"/>
+        <w:jc w:val="left"/>
+        <w:tblLook w:firstColumn="1" w:firstRow="1" w:lastColumn="0" w:lastRow="0" w:noHBand="0" w:noVBand="1" w:val="04A0"/>
+      </w:tblPr>
+      <w:tblGrid>
+        <w:gridCol w:w="10086"/>
+      </w:tblGrid>
+      <w:tr>
+        <w:trPr>
+          <w:cantSplit/>
+        </w:trPr>
+        <w:tc>
+          <w:tcPr>
+            <w:tcW w:type="dxa" w:w="10086"/>
+            <w:shd w:fill="F2F2F2"/>
+          </w:tcPr>
+          <w:p>
+            <w:pPr>
+              <w:keepNext/>
+              <w:spacing w:after="40"/>
+            </w:pPr>
+            <w:r>
+              <w:rPr>
+                <w:b/>
+                <w:color w:val="111111"/>
+                <w:sz w:val="20"/>
+              </w:rPr>
+              <w:t>Deux mots de métier :</w:t>
+            </w:r>
+          </w:p>
+          <w:p>
+            <w:pPr>
+              <w:keepNext/>
+              <w:spacing w:before="0" w:after="40"/>
+              <w:ind w:left="397" w:hanging="227"/>
+            </w:pPr>
+            <w:r>
+              <w:rPr>
+                <w:sz w:val="20"/>
+              </w:rPr>
+              <w:t>•  un inventaire : compter à la main ce qu'il y a vraiment dans les rayons, puis comparer avec le chiffre de l'ordinateur ;</w:t>
+            </w:r>
+          </w:p>
+          <w:p>
+            <w:pPr>
+              <w:spacing w:before="0" w:after="0"/>
+              <w:ind w:left="397" w:hanging="227"/>
+            </w:pPr>
+            <w:r>
+              <w:rPr>
+                <w:sz w:val="20"/>
+              </w:rPr>
+              <w:t>•  le stock du système : le chiffre de l'ordinateur. C'est lui que le site affiche aux clients.</w:t>
+            </w:r>
+          </w:p>
         </w:tc>
       </w:tr>
     </w:tbl>
@@ -1718,7 +1918,7 @@
                 <w:b/>
                 <w:sz w:val="21"/>
               </w:rPr>
-              <w:t>Nadia veut comprendre comment le stock est arrivé là, pas seulement connaître son chiffre. Pourquoi, à ton avis ?</w:t>
+              <w:t>Le système dit qu'il reste des écouteurs, le rayon est vide. D'après toi, avant de chercher, qu'est-ce qui a pu se passer ?</w:t>
             </w:r>
           </w:p>
           <w:p>
@@ -1801,7 +2001,7 @@
           <w:color w:val="111111"/>
           <w:sz w:val="30"/>
         </w:rPr>
-        <w:t>Relever le stock actuel</w:t>
+        <w:t>Relever le stock actuel et l'envoyer</w:t>
       </w:r>
     </w:p>
     <w:p>
@@ -1814,7 +2014,7 @@
           <w:color w:val="1A1A1A"/>
           <w:sz w:val="22"/>
         </w:rPr>
-        <w:t>Tu vas relever le stock d'écouteurs qu'affiche le système aujourd'hui. Il y a deux façons de le faire : essaie les deux.</w:t>
+        <w:t>Tu vas relever le stock d'écouteurs que le système affiche aujourd'hui. Il y a deux façons de le faire : essaie les deux.</w:t>
       </w:r>
     </w:p>
     <w:p>
@@ -1835,7 +2035,7 @@
         <w:rPr>
           <w:sz w:val="22"/>
         </w:rPr>
-        <w:t>Façon 1, par l'écran : clique sur « Stock » dans le menu de gauche (sous « Articles »). Si l'écran dit « Accès verrouillé », demande le code à ton enseignant, tape-le puis clique sur « Déverrouiller ».</w:t>
+        <w:t>Façon 1, par l'écran : dans le menu, clique sur « Stock » (sous « Articles »). L'écran dit « Accès verrouillé » : demande le code à ton enseignant, tape-le dans « Code d'accès », puis clique sur « Déverrouiller ».</w:t>
       </w:r>
     </w:p>
     <w:p>
@@ -1856,7 +2056,7 @@
         <w:rPr>
           <w:sz w:val="22"/>
         </w:rPr>
-        <w:t>Dans l'onglet « Niveaux de stock », cherche ton article avec le champ « Recherche » et lis sa quantité en stock.</w:t>
+        <w:t>Dans l'onglet « Niveaux de stock », trouve la ligne de l'article et lis la colonne « Stock ».</w:t>
       </w:r>
     </w:p>
     <w:p>
@@ -1877,7 +2077,7 @@
         <w:rPr>
           <w:sz w:val="22"/>
         </w:rPr>
-        <w:t>Façon 2, par la console : clique sur « Console » (sous « Outils »). Tape d'abord .help pour voir les commandes. Puis tape .getstock, un espace, et la référence de l'article.</w:t>
+        <w:t>Façon 2, par la console : clique sur « Console » (sous « Outils »). Tape .help puis Entrée pour voir les commandes. Tape ensuite .getstock, un espace, la référence de l'article, puis Entrée.</w:t>
       </w:r>
     </w:p>
     <w:tbl>
@@ -1949,7 +2149,7 @@
               <w:rPr>
                 <w:sz w:val="20"/>
               </w:rPr>
-              <w:t>Écran « Stock »</w:t>
+              <w:t>Écran « Stock »</w:t>
             </w:r>
           </w:p>
         </w:tc>
@@ -2005,6 +2205,9 @@
         <w:gridCol w:w="10086"/>
       </w:tblGrid>
       <w:tr>
+        <w:trPr>
+          <w:cantSplit/>
+        </w:trPr>
         <w:tc>
           <w:tcPr>
             <w:tcW w:type="dxa" w:w="10086"/>
@@ -2012,7 +2215,8 @@
           </w:tcPr>
           <w:p>
             <w:pPr>
-              <w:spacing w:after="0"/>
+              <w:keepNext/>
+              <w:spacing w:after="40"/>
             </w:pPr>
             <w:r>
               <w:rPr>
@@ -2020,13 +2224,45 @@
                 <w:color w:val="111111"/>
                 <w:sz w:val="20"/>
               </w:rPr>
-              <w:t xml:space="preserve">Ce que tu dois voir : </w:t>
+              <w:t>Ce que tu dois voir :</w:t>
             </w:r>
+          </w:p>
+          <w:p>
+            <w:pPr>
+              <w:keepNext/>
+              <w:spacing w:before="0" w:after="40"/>
+              <w:ind w:left="397" w:hanging="227"/>
+            </w:pPr>
             <w:r>
               <w:rPr>
                 <w:sz w:val="20"/>
               </w:rPr>
-              <w:t>sur l'écran Stock, des cases de chiffres en haut, puis la liste des références ; dans la console, une réponse avec la référence et la quantité. Les deux nombres doivent être identiques. Sinon, vérifie que tu as bien écrit la référence.</w:t>
+              <w:t>•  sur l'écran Stock : des cases de chiffres en haut, puis une ligne par référence ;</w:t>
+            </w:r>
+          </w:p>
+          <w:p>
+            <w:pPr>
+              <w:keepNext/>
+              <w:spacing w:before="0" w:after="40"/>
+              <w:ind w:left="397" w:hanging="227"/>
+            </w:pPr>
+            <w:r>
+              <w:rPr>
+                <w:sz w:val="20"/>
+              </w:rPr>
+              <w:t>•  dans la console : une fiche avec la référence, l'article, le stock, l'emplacement ;</w:t>
+            </w:r>
+          </w:p>
+          <w:p>
+            <w:pPr>
+              <w:spacing w:before="0" w:after="0"/>
+              <w:ind w:left="397" w:hanging="227"/>
+            </w:pPr>
+            <w:r>
+              <w:rPr>
+                <w:sz w:val="20"/>
+              </w:rPr>
+              <w:t>•  le même nombre aux deux endroits. Sinon, vérifie la référence que tu as tapée.</w:t>
             </w:r>
           </w:p>
         </w:tc>
@@ -2039,11 +2275,11 @@
     </w:p>
     <w:p>
       <w:pPr>
-        <w:spacing w:before="0" w:after="120"/>
+        <w:spacing w:before="80" w:after="120"/>
       </w:pPr>
       <w:r>
         <w:rPr>
-          <w:b w:val="0"/>
+          <w:b/>
           <w:color w:val="1A1A1A"/>
           <w:sz w:val="22"/>
         </w:rPr>
@@ -2068,7 +2304,7 @@
         <w:rPr>
           <w:sz w:val="22"/>
         </w:rPr>
-        <w:t>Dans « Messagerie », ouvre le message de Nadia et clique sur « Répondre ».</w:t>
+        <w:t>Dans « Messagerie », ouvre le message de Nadia sur les écouteurs et clique sur « Répondre ».</w:t>
       </w:r>
     </w:p>
     <w:p>
@@ -2089,7 +2325,7 @@
         <w:rPr>
           <w:sz w:val="22"/>
         </w:rPr>
-        <w:t>Complète seulement la première ligne (« Stock actuel : ») avec le nombre que tu as relevé, puis clique sur « Envoyer ».</w:t>
+        <w:t>Les sept intitulés sont déjà écrits. Complète seulement la première ligne (« Stock actuel : ») avec ton nombre, en chiffres. Clique sur « Envoyer ».</w:t>
       </w:r>
     </w:p>
     <w:tbl>
@@ -2103,6 +2339,9 @@
         <w:gridCol w:w="10086"/>
       </w:tblGrid>
       <w:tr>
+        <w:trPr>
+          <w:cantSplit/>
+        </w:trPr>
         <w:tc>
           <w:tcPr>
             <w:tcW w:type="dxa" w:w="10086"/>
@@ -2110,7 +2349,8 @@
           </w:tcPr>
           <w:p>
             <w:pPr>
-              <w:spacing w:after="0"/>
+              <w:keepNext/>
+              <w:spacing w:after="40"/>
             </w:pPr>
             <w:r>
               <w:rPr>
@@ -2118,13 +2358,32 @@
                 <w:color w:val="111111"/>
                 <w:sz w:val="20"/>
               </w:rPr>
-              <w:t xml:space="preserve">Ce que tu dois voir : </w:t>
+              <w:t>Ce que tu dois voir :</w:t>
             </w:r>
+          </w:p>
+          <w:p>
+            <w:pPr>
+              <w:keepNext/>
+              <w:spacing w:before="0" w:after="40"/>
+              <w:ind w:left="397" w:hanging="227"/>
+            </w:pPr>
             <w:r>
               <w:rPr>
                 <w:sz w:val="20"/>
               </w:rPr>
-              <w:t>en bas de l'écran, « Réponse envoyée. Nouveau message » ; à côté de « Messagerie », le nombre de messages non lus augmente. Ces nouveaux messages te serviront à l'étape 5.</w:t>
+              <w:t>•  en bas de l'écran : « Réponse envoyée. Nouveau message » ;</w:t>
+            </w:r>
+          </w:p>
+          <w:p>
+            <w:pPr>
+              <w:spacing w:before="0" w:after="0"/>
+              <w:ind w:left="397" w:hanging="227"/>
+            </w:pPr>
+            <w:r>
+              <w:rPr>
+                <w:sz w:val="20"/>
+              </w:rPr>
+              <w:t>•  de nouveaux messages arrivent dans « Réception ». Ils te serviront à l'étape 5.</w:t>
             </w:r>
           </w:p>
         </w:tc>
@@ -2184,7 +2443,7 @@
                 <w:b/>
                 <w:sz w:val="21"/>
               </w:rPr>
-              <w:t>Quelle façon de lire le stock te paraît la plus sûre ? Explique ton choix.</w:t>
+              <w:t>Ce nombre te dit-il comment le stock est arrivé là ? Explique ta réponse.</w:t>
             </w:r>
           </w:p>
           <w:p>
@@ -2229,70 +2488,6 @@
           </w:p>
         </w:tc>
       </w:tr>
-      <w:tr>
-        <w:trPr>
-          <w:cantSplit/>
-          <w:trHeight w:val="2438"/>
-        </w:trPr>
-        <w:tc>
-          <w:tcPr>
-            <w:tcW w:type="dxa" w:w="10086"/>
-            <w:shd w:fill="FAFAFA"/>
-          </w:tcPr>
-          <w:p>
-            <w:pPr>
-              <w:spacing w:after="80"/>
-            </w:pPr>
-            <w:r>
-              <w:rPr>
-                <w:b/>
-                <w:sz w:val="21"/>
-              </w:rPr>
-              <w:t>Ce nombre dit-il à lui seul comment le stock est arrivé là ? Explique.</w:t>
-            </w:r>
-          </w:p>
-          <w:p>
-            <w:pPr>
-              <w:spacing w:before="0" w:after="80"/>
-            </w:pPr>
-            <w:r>
-              <w:rPr>
-                <w:sz w:val="22"/>
-              </w:rPr>
-            </w:r>
-          </w:p>
-          <w:p>
-            <w:pPr>
-              <w:spacing w:before="0" w:after="80"/>
-            </w:pPr>
-            <w:r>
-              <w:rPr>
-                <w:sz w:val="22"/>
-              </w:rPr>
-            </w:r>
-          </w:p>
-          <w:p>
-            <w:pPr>
-              <w:spacing w:before="0" w:after="80"/>
-            </w:pPr>
-            <w:r>
-              <w:rPr>
-                <w:sz w:val="22"/>
-              </w:rPr>
-            </w:r>
-          </w:p>
-          <w:p>
-            <w:pPr>
-              <w:spacing w:before="0" w:after="80"/>
-            </w:pPr>
-            <w:r>
-              <w:rPr>
-                <w:sz w:val="22"/>
-              </w:rPr>
-            </w:r>
-          </w:p>
-        </w:tc>
-      </w:tr>
     </w:tbl>
     <w:p>
       <w:pPr>
@@ -2331,7 +2526,7 @@
           <w:color w:val="111111"/>
           <w:sz w:val="30"/>
         </w:rPr>
-        <w:t>Lister les mouvements et remplir la fiche de stock</w:t>
+        <w:t>Lister les mouvements sur une fiche de stock</w:t>
       </w:r>
     </w:p>
     <w:p>
@@ -2345,7 +2540,7 @@
           <w:color w:val="1A1A1A"/>
           <w:sz w:val="22"/>
         </w:rPr>
-        <w:t>Un mouvement de stock, c'est chaque fois que des articles entrent dans l'entrepôt ou en sortent. Le système les garde tous. Tu vas recopier ceux de ton article sur une fiche de stock, comme on le faisait sur papier avant l'ordinateur.</w:t>
+        <w:t>Un mouvement de stock, c'est chaque fois que des articles entrent ou sortent. Le système les garde tous. Tu vas recopier ceux de l'article sur une fiche de stock.</w:t>
       </w:r>
     </w:p>
     <w:tbl>
@@ -2380,17 +2575,12 @@
               <w:rPr>
                 <w:sz w:val="20"/>
               </w:rPr>
-              <w:t>une fiche de stock suit UN seul article. Une ligne par mouvement : la date, le document qui l'a provoqué, ce qui est entré, ce qui est sorti, et ce qu'il reste après.</w:t>
+              <w:t>une fiche de stock suit UN seul article : une ligne par mouvement, avec la date, le document, l'entrée, la sortie et le stock après.</w:t>
             </w:r>
           </w:p>
         </w:tc>
       </w:tr>
     </w:tbl>
-    <w:p>
-      <w:pPr>
-        <w:spacing w:after="40"/>
-      </w:pPr>
-    </w:p>
     <w:p>
       <w:pPr>
         <w:keepNext/>
@@ -2409,7 +2599,7 @@
         <w:rPr>
           <w:sz w:val="22"/>
         </w:rPr>
-        <w:t>Clique sur « Stock », puis sur l'onglet « Mouvements ».</w:t>
+        <w:t>Clique sur « Stock », puis sur l'onglet « Mouvements ». La liste mélange plusieurs articles : regarde la colonne « Réf. ». Dans la console, .movements suivi de la référence n'affiche que ton article.</w:t>
       </w:r>
     </w:p>
     <w:p>
@@ -2430,7 +2620,7 @@
         <w:rPr>
           <w:sz w:val="22"/>
         </w:rPr>
-        <w:t>Cette liste mélange plusieurs articles : repère les lignes de ton article (colonne « Réf. »). Dans la console, .movements suivi de la référence n'affiche que lui.</w:t>
+        <w:t>À l'écran, le plus récent est en haut. Sur ta fiche, écris du plus ancien (en haut) au plus récent.</w:t>
       </w:r>
     </w:p>
     <w:p>
@@ -2451,7 +2641,7 @@
         <w:rPr>
           <w:sz w:val="22"/>
         </w:rPr>
-        <w:t>Lis les colonnes : Date, Type, Qté (un + entre, un − sort), Stock après, Origine (le code du document).</w:t>
+        <w:t>Une entrée va dans la colonne « Entrée », une sortie dans « Sortie » : écris le nombre sans le signe. La colonne « Origine » de l'écran donne le document.</w:t>
       </w:r>
     </w:p>
     <w:p>
@@ -2472,62 +2662,7 @@
         <w:rPr>
           <w:sz w:val="22"/>
         </w:rPr>
-        <w:t>Recopie les mouvements de ton article sur la fiche, du plus ancien (en haut) au plus récent. À l'écran, ils ne sont pas dans cet ordre : regarde la date et l'heure.</w:t>
-      </w:r>
-    </w:p>
-    <w:p>
-      <w:pPr>
-        <w:keepNext/>
-        <w:spacing w:after="80"/>
-        <w:ind w:left="454" w:hanging="454"/>
-      </w:pPr>
-      <w:r>
-        <w:rPr>
-          <w:b/>
-          <w:color w:val="111111"/>
-          <w:sz w:val="22"/>
-        </w:rPr>
-        <w:t xml:space="preserve">5.  </w:t>
-      </w:r>
-      <w:r>
-        <w:rPr>
-          <w:sz w:val="22"/>
-        </w:rPr>
-        <w:t>Une entrée va dans la colonne « Entrée », une sortie dans la colonne « Sortie » : écris le nombre sans le signe.</w:t>
-      </w:r>
-    </w:p>
-    <w:p>
-      <w:pPr>
-        <w:spacing w:after="80"/>
-        <w:ind w:left="454" w:hanging="454"/>
-      </w:pPr>
-      <w:r>
-        <w:rPr>
-          <w:b/>
-          <w:color w:val="111111"/>
-          <w:sz w:val="22"/>
-        </w:rPr>
-        <w:t xml:space="preserve">6.  </w:t>
-      </w:r>
-      <w:r>
-        <w:rPr>
-          <w:sz w:val="22"/>
-        </w:rPr>
-        <w:t>Laisse vide la case « Stock après » de la ligne « Inventaire » : tu la rempliras à l'étape 6.</w:t>
-      </w:r>
-    </w:p>
-    <w:p>
-      <w:pPr>
-        <w:keepNext/>
-        <w:spacing w:before="120" w:after="80"/>
-      </w:pPr>
-      <w:r>
-        <w:rPr>
-          <w:b/>
-          <w:color w:val="1A1A1A"/>
-          <w:sz w:val="21"/>
-        </w:rPr>
-        <w:t>Fiche de stock de l'article (référence) : …………………………………………</w:t>
+        <w:t>Laisse vide le « Stock après » de la ligne « Inventaire » : tu le trouveras à l'étape 7. Tu n'auras peut-être pas besoin de toutes les lignes.</w:t>
       </w:r>
     </w:p>
     <w:tbl>
@@ -2545,6 +2680,9 @@
         <w:gridCol w:w="2154"/>
       </w:tblGrid>
       <w:tr>
+        <w:trPr>
+          <w:trHeight w:hRule="exact"/>
+        </w:trPr>
         <w:tc>
           <w:tcPr>
             <w:tcW w:type="dxa" w:w="2098"/>
@@ -2648,7 +2786,7 @@
       </w:tr>
       <w:tr>
         <w:trPr>
-          <w:trHeight w:val="539"/>
+          <w:trHeight w:val="386" w:hRule="exact"/>
         </w:trPr>
         <w:tc>
           <w:tcPr>
@@ -2662,7 +2800,7 @@
               <w:rPr>
                 <w:sz w:val="20"/>
               </w:rPr>
-              <w:t>Il y a 7 jours</w:t>
+              <w:t>Dernier inventaire</w:t>
             </w:r>
           </w:p>
         </w:tc>
@@ -2706,14 +2844,14 @@
               <w:rPr>
                 <w:sz w:val="20"/>
               </w:rPr>
-              <w:t>à compléter à l'étape 6</w:t>
+              <w:t>à trouver à l'étape 7</w:t>
             </w:r>
           </w:p>
         </w:tc>
       </w:tr>
       <w:tr>
         <w:trPr>
-          <w:trHeight w:val="539"/>
+          <w:trHeight w:val="386" w:hRule="exact"/>
         </w:trPr>
         <w:tc>
           <w:tcPr>
@@ -2748,7 +2886,7 @@
       </w:tr>
       <w:tr>
         <w:trPr>
-          <w:trHeight w:val="539"/>
+          <w:trHeight w:val="386" w:hRule="exact"/>
         </w:trPr>
         <w:tc>
           <w:tcPr>
@@ -2783,7 +2921,7 @@
       </w:tr>
       <w:tr>
         <w:trPr>
-          <w:trHeight w:val="539"/>
+          <w:trHeight w:val="386" w:hRule="exact"/>
         </w:trPr>
         <w:tc>
           <w:tcPr>
@@ -2818,7 +2956,7 @@
       </w:tr>
       <w:tr>
         <w:trPr>
-          <w:trHeight w:val="539"/>
+          <w:trHeight w:val="386" w:hRule="exact"/>
         </w:trPr>
         <w:tc>
           <w:tcPr>
@@ -2853,7 +2991,7 @@
       </w:tr>
       <w:tr>
         <w:trPr>
-          <w:trHeight w:val="539"/>
+          <w:trHeight w:val="386" w:hRule="exact"/>
         </w:trPr>
         <w:tc>
           <w:tcPr>
@@ -2888,7 +3026,7 @@
       </w:tr>
       <w:tr>
         <w:trPr>
-          <w:trHeight w:val="539"/>
+          <w:trHeight w:val="386" w:hRule="exact"/>
         </w:trPr>
         <w:tc>
           <w:tcPr>
@@ -2923,7 +3061,7 @@
       </w:tr>
       <w:tr>
         <w:trPr>
-          <w:trHeight w:val="539"/>
+          <w:trHeight w:val="386" w:hRule="exact"/>
         </w:trPr>
         <w:tc>
           <w:tcPr>
@@ -2958,7 +3096,7 @@
       </w:tr>
       <w:tr>
         <w:trPr>
-          <w:trHeight w:val="539"/>
+          <w:trHeight w:val="386" w:hRule="exact"/>
         </w:trPr>
         <w:tc>
           <w:tcPr>
@@ -2993,7 +3131,7 @@
       </w:tr>
       <w:tr>
         <w:trPr>
-          <w:trHeight w:val="539"/>
+          <w:trHeight w:val="386" w:hRule="exact"/>
         </w:trPr>
         <w:tc>
           <w:tcPr>
@@ -3028,7 +3166,77 @@
       </w:tr>
       <w:tr>
         <w:trPr>
-          <w:trHeight w:val="539"/>
+          <w:trHeight w:val="386" w:hRule="exact"/>
+        </w:trPr>
+        <w:tc>
+          <w:tcPr>
+            <w:tcW w:type="dxa" w:w="2098"/>
+          </w:tcPr>
+          <w:p/>
+        </w:tc>
+        <w:tc>
+          <w:tcPr>
+            <w:tcW w:type="dxa" w:w="2891"/>
+          </w:tcPr>
+          <w:p/>
+        </w:tc>
+        <w:tc>
+          <w:tcPr>
+            <w:tcW w:type="dxa" w:w="1247"/>
+          </w:tcPr>
+          <w:p/>
+        </w:tc>
+        <w:tc>
+          <w:tcPr>
+            <w:tcW w:type="dxa" w:w="1247"/>
+          </w:tcPr>
+          <w:p/>
+        </w:tc>
+        <w:tc>
+          <w:tcPr>
+            <w:tcW w:type="dxa" w:w="2154"/>
+          </w:tcPr>
+          <w:p/>
+        </w:tc>
+      </w:tr>
+      <w:tr>
+        <w:trPr>
+          <w:trHeight w:val="386" w:hRule="exact"/>
+        </w:trPr>
+        <w:tc>
+          <w:tcPr>
+            <w:tcW w:type="dxa" w:w="2098"/>
+          </w:tcPr>
+          <w:p/>
+        </w:tc>
+        <w:tc>
+          <w:tcPr>
+            <w:tcW w:type="dxa" w:w="2891"/>
+          </w:tcPr>
+          <w:p/>
+        </w:tc>
+        <w:tc>
+          <w:tcPr>
+            <w:tcW w:type="dxa" w:w="1247"/>
+          </w:tcPr>
+          <w:p/>
+        </w:tc>
+        <w:tc>
+          <w:tcPr>
+            <w:tcW w:type="dxa" w:w="1247"/>
+          </w:tcPr>
+          <w:p/>
+        </w:tc>
+        <w:tc>
+          <w:tcPr>
+            <w:tcW w:type="dxa" w:w="2154"/>
+          </w:tcPr>
+          <w:p/>
+        </w:tc>
+      </w:tr>
+      <w:tr>
+        <w:trPr>
+          <w:trHeight w:val="386" w:hRule="exact"/>
         </w:trPr>
         <w:tc>
           <w:tcPr>
@@ -3064,21 +3272,9 @@
     </w:tbl>
     <w:p>
       <w:pPr>
+        <w:keepNext/>
         <w:spacing w:after="40"/>
       </w:pPr>
-    </w:p>
-    <w:p>
-      <w:pPr>
-        <w:spacing w:before="0" w:after="80"/>
-      </w:pPr>
-      <w:r>
-        <w:rPr>
-          <w:b w:val="0"/>
-          <w:color w:val="1A1A1A"/>
-          <w:sz w:val="19"/>
-        </w:rPr>
-        <w:t>Tu n'auras peut-être pas besoin de toutes les lignes.</w:t>
-      </w:r>
     </w:p>
     <w:tbl>
       <w:tblPr>
@@ -3091,6 +3287,9 @@
         <w:gridCol w:w="10086"/>
       </w:tblGrid>
       <w:tr>
+        <w:trPr>
+          <w:cantSplit/>
+        </w:trPr>
         <w:tc>
           <w:tcPr>
             <w:tcW w:type="dxa" w:w="10086"/>
@@ -3098,8 +3297,8 @@
           </w:tcPr>
           <w:p>
             <w:pPr>
-              <w:pageBreakBefore/>
-              <w:spacing w:after="0"/>
+              <w:keepNext/>
+              <w:spacing w:after="40"/>
             </w:pPr>
             <w:r>
               <w:rPr>
@@ -3113,7 +3312,32 @@
               <w:rPr>
                 <w:sz w:val="20"/>
               </w:rPr>
-              <w:t>pour chaque ligne sauf la première, le « Stock après » est égal au « Stock après » de la ligne du dessus, plus l'entrée ou moins la sortie. La dernière ligne de ta fiche affiche le même nombre que le stock actuel de l'étape 3. Si ce n'est pas le cas, tu as sauté un mouvement, ou les lignes ne sont pas dans le bon ordre.</w:t>
+              <w:t>Sinon, tu as sauté un mouvement, ou tes lignes ne sont pas dans l'ordre.</w:t>
+            </w:r>
+          </w:p>
+          <w:p>
+            <w:pPr>
+              <w:keepNext/>
+              <w:spacing w:before="0" w:after="40"/>
+              <w:ind w:left="397" w:hanging="227"/>
+            </w:pPr>
+            <w:r>
+              <w:rPr>
+                <w:sz w:val="20"/>
+              </w:rPr>
+              <w:t>•  sur chaque ligne, le « Stock après » = celui de la ligne du dessus + l'entrée − la sortie ;</w:t>
+            </w:r>
+          </w:p>
+          <w:p>
+            <w:pPr>
+              <w:spacing w:before="0" w:after="0"/>
+              <w:ind w:left="397" w:hanging="227"/>
+            </w:pPr>
+            <w:r>
+              <w:rPr>
+                <w:sz w:val="20"/>
+              </w:rPr>
+              <w:t>•  la dernière ligne de ta fiche donne le stock actuel de l'étape 3.</w:t>
             </w:r>
           </w:p>
         </w:tc>
@@ -3173,71 +3397,7 @@
                 <w:b/>
                 <w:sz w:val="21"/>
               </w:rPr>
-              <w:t>Regarde la colonne « Type » de ta fiche : que remarques-tu ?</w:t>
-            </w:r>
-          </w:p>
-          <w:p>
-            <w:pPr>
-              <w:spacing w:before="0" w:after="80"/>
-            </w:pPr>
-            <w:r>
-              <w:rPr>
-                <w:sz w:val="22"/>
-              </w:rPr>
-            </w:r>
-          </w:p>
-          <w:p>
-            <w:pPr>
-              <w:spacing w:before="0" w:after="80"/>
-            </w:pPr>
-            <w:r>
-              <w:rPr>
-                <w:sz w:val="22"/>
-              </w:rPr>
-            </w:r>
-          </w:p>
-          <w:p>
-            <w:pPr>
-              <w:spacing w:before="0" w:after="80"/>
-            </w:pPr>
-            <w:r>
-              <w:rPr>
-                <w:sz w:val="22"/>
-              </w:rPr>
-            </w:r>
-          </w:p>
-          <w:p>
-            <w:pPr>
-              <w:spacing w:before="0" w:after="80"/>
-            </w:pPr>
-            <w:r>
-              <w:rPr>
-                <w:sz w:val="22"/>
-              </w:rPr>
-            </w:r>
-          </w:p>
-        </w:tc>
-      </w:tr>
-      <w:tr>
-        <w:trPr>
-          <w:cantSplit/>
-          <w:trHeight w:val="2438"/>
-        </w:trPr>
-        <w:tc>
-          <w:tcPr>
-            <w:tcW w:type="dxa" w:w="10086"/>
-            <w:shd w:fill="FAFAFA"/>
-          </w:tcPr>
-          <w:p>
-            <w:pPr>
-              <w:spacing w:after="80"/>
-            </w:pPr>
-            <w:r>
-              <w:rPr>
-                <w:b/>
-                <w:sz w:val="21"/>
-              </w:rPr>
-              <w:t>Pourquoi, à ton avis, le système garde-t-il le « Stock après » à chaque ligne, et pas seulement le stock du jour ?</w:t>
+              <w:t>Regarde la colonne « Type » de l'écran pour les lignes de ta fiche. Que remarques-tu ?</w:t>
             </w:r>
           </w:p>
           <w:p>
@@ -3334,7 +3494,7 @@
           <w:color w:val="1A1A1A"/>
           <w:sz w:val="22"/>
         </w:rPr>
-        <w:t>Un mouvement de stock doit toujours avoir un document : sans lui, personne ne peut dire pourquoi le stock a bougé. La colonne « Origine » de ta fiche te donne le code de ce document. À toi de retrouver chacun d'eux.</w:t>
+        <w:t>Un mouvement de stock doit toujours avoir un document : sans lui, personne ne peut dire pourquoi le stock a bougé. La colonne « Document » de ta fiche te donne son code. Retrouve chacun de ces documents.</w:t>
       </w:r>
     </w:p>
     <w:tbl>
@@ -3348,6 +3508,9 @@
         <w:gridCol w:w="10086"/>
       </w:tblGrid>
       <w:tr>
+        <w:trPr>
+          <w:cantSplit/>
+        </w:trPr>
         <w:tc>
           <w:tcPr>
             <w:tcW w:type="dxa" w:w="10086"/>
@@ -3355,7 +3518,8 @@
           </w:tcPr>
           <w:p>
             <w:pPr>
-              <w:spacing w:after="0"/>
+              <w:keepNext/>
+              <w:spacing w:after="40"/>
             </w:pPr>
             <w:r>
               <w:rPr>
@@ -3363,57 +3527,58 @@
                 <w:color w:val="111111"/>
                 <w:sz w:val="20"/>
               </w:rPr>
-              <w:t xml:space="preserve">Des mots de métier : </w:t>
+              <w:t>Des mots de métier :</w:t>
             </w:r>
+          </w:p>
+          <w:p>
+            <w:pPr>
+              <w:keepNext/>
+              <w:spacing w:before="0" w:after="40"/>
+              <w:ind w:left="397" w:hanging="227"/>
+            </w:pPr>
             <w:r>
               <w:rPr>
                 <w:sz w:val="20"/>
               </w:rPr>
-              <w:t>une réception est une livraison d'un fournisseur ; elle arrive avec un bon de livraison. Un bon de préparation dit au préparateur quels articles sortir du rayon pour une commande client. Un retour client, c'est un article que le client renvoie. La casse, c'est un article abîmé qu'on ne peut plus vendre.</w:t>
+              <w:t>•  une réception : une livraison d'un fournisseur, avec son bon de livraison ;</w:t>
             </w:r>
           </w:p>
-        </w:tc>
-      </w:tr>
-    </w:tbl>
-    <w:p>
-      <w:pPr>
-        <w:keepNext/>
-        <w:spacing w:after="40"/>
-      </w:pPr>
-    </w:p>
-    <w:tbl>
-      <w:tblPr>
-        <w:tblStyle w:val="TableGrid"/>
-        <w:tblW w:type="auto" w:w="0"/>
-        <w:jc w:val="left"/>
-        <w:tblLook w:firstColumn="1" w:firstRow="1" w:lastColumn="0" w:lastRow="0" w:noHBand="0" w:noVBand="1" w:val="04A0"/>
-      </w:tblPr>
-      <w:tblGrid>
-        <w:gridCol w:w="10086"/>
-      </w:tblGrid>
-      <w:tr>
-        <w:tc>
-          <w:tcPr>
-            <w:tcW w:type="dxa" w:w="10086"/>
-            <w:shd w:fill="F2F2F2"/>
-          </w:tcPr>
           <w:p>
             <w:pPr>
-              <w:spacing w:after="0"/>
+              <w:keepNext/>
+              <w:spacing w:before="0" w:after="40"/>
+              <w:ind w:left="397" w:hanging="227"/>
             </w:pPr>
-            <w:r>
-              <w:rPr>
-                <w:b/>
-                <w:color w:val="111111"/>
-                <w:sz w:val="20"/>
-              </w:rPr>
-              <w:t xml:space="preserve">Nadia le précise dans son message : </w:t>
-            </w:r>
             <w:r>
               <w:rPr>
                 <w:sz w:val="20"/>
               </w:rPr>
-              <w:t>un bon de préparation BP-… porte les mêmes chiffres que sa commande CMD-… : pour retrouver la commande, cherche dans « Commandes » celle qui a les mêmes chiffres que le bon.</w:t>
+              <w:t>•  un bon de préparation (BP-…) : la liste des articles à sortir du rayon pour une commande client. Il porte les mêmes chiffres que sa commande (CMD-…) ;</w:t>
+            </w:r>
+          </w:p>
+          <w:p>
+            <w:pPr>
+              <w:keepNext/>
+              <w:spacing w:before="0" w:after="40"/>
+              <w:ind w:left="397" w:hanging="227"/>
+            </w:pPr>
+            <w:r>
+              <w:rPr>
+                <w:sz w:val="20"/>
+              </w:rPr>
+              <w:t>•  un retour client : un article que le client renvoie ;</w:t>
+            </w:r>
+          </w:p>
+          <w:p>
+            <w:pPr>
+              <w:spacing w:before="0" w:after="0"/>
+              <w:ind w:left="397" w:hanging="227"/>
+            </w:pPr>
+            <w:r>
+              <w:rPr>
+                <w:sz w:val="20"/>
+              </w:rPr>
+              <w:t>•  la casse : un article abîmé qu'on ne peut plus vendre.</w:t>
             </w:r>
           </w:p>
         </w:tc>
@@ -3442,7 +3607,7 @@
         <w:rPr>
           <w:sz w:val="22"/>
         </w:rPr>
-        <w:t>Les documents se trouvent à trois endroits : les menus « Réceptions » et « Commandes », et la « Messagerie ». Pour chaque type de mouvement, décide où chercher et complète le premier tableau.</w:t>
+        <w:t>Complète d'abord le premier tableau : pour chaque type de mouvement, où chercher le document ? Les documents sont dans les menus « Réceptions » et « Commandes », et dans la « Messagerie ».</w:t>
       </w:r>
     </w:p>
     <w:p>
@@ -3463,7 +3628,7 @@
         <w:rPr>
           <w:sz w:val="22"/>
         </w:rPr>
-        <w:t>Dans « Réceptions » et « Commandes », le bouton « Ouvrir » ouvre le document. Ouvre-les un par un, et complète les tableaux suivants.</w:t>
+        <w:t>Dans « Réceptions » puis « Commandes », clique sur « Ouvrir » au bout d'une ligne pour lire le document.</w:t>
       </w:r>
     </w:p>
     <w:tbl>
@@ -3521,7 +3686,7 @@
       </w:tr>
       <w:tr>
         <w:trPr>
-          <w:trHeight w:val="510"/>
+          <w:trHeight w:val="482"/>
         </w:trPr>
         <w:tc>
           <w:tcPr>
@@ -3548,7 +3713,7 @@
       </w:tr>
       <w:tr>
         <w:trPr>
-          <w:trHeight w:val="510"/>
+          <w:trHeight w:val="482"/>
         </w:trPr>
         <w:tc>
           <w:tcPr>
@@ -3575,7 +3740,7 @@
       </w:tr>
       <w:tr>
         <w:trPr>
-          <w:trHeight w:val="510"/>
+          <w:trHeight w:val="482"/>
         </w:trPr>
         <w:tc>
           <w:tcPr>
@@ -3602,7 +3767,7 @@
       </w:tr>
       <w:tr>
         <w:trPr>
-          <w:trHeight w:val="510"/>
+          <w:trHeight w:val="482"/>
         </w:trPr>
         <w:tc>
           <w:tcPr>
@@ -3636,7 +3801,7 @@
     <w:p>
       <w:pPr>
         <w:keepNext/>
-        <w:spacing w:before="80" w:after="80"/>
+        <w:spacing w:before="40" w:after="80"/>
       </w:pPr>
       <w:r>
         <w:rPr>
@@ -3644,7 +3809,7 @@
           <w:color w:val="1A1A1A"/>
           <w:sz w:val="21"/>
         </w:rPr>
-        <w:t>Dans « Réceptions », ouvre chaque réception de la liste :</w:t>
+        <w:t>Dans « Réceptions », ouvre chaque réception de la liste :</w:t>
       </w:r>
     </w:p>
     <w:tbl>
@@ -3744,7 +3909,7 @@
       </w:tr>
       <w:tr>
         <w:trPr>
-          <w:trHeight w:val="567"/>
+          <w:trHeight w:val="510"/>
         </w:trPr>
         <w:tc>
           <w:tcPr>
@@ -3773,7 +3938,7 @@
       </w:tr>
       <w:tr>
         <w:trPr>
-          <w:trHeight w:val="567"/>
+          <w:trHeight w:val="510"/>
         </w:trPr>
         <w:tc>
           <w:tcPr>
@@ -3802,7 +3967,7 @@
       </w:tr>
       <w:tr>
         <w:trPr>
-          <w:trHeight w:val="567"/>
+          <w:trHeight w:val="510"/>
         </w:trPr>
         <w:tc>
           <w:tcPr>
@@ -3831,7 +3996,7 @@
       </w:tr>
       <w:tr>
         <w:trPr>
-          <w:trHeight w:val="567"/>
+          <w:trHeight w:val="510"/>
         </w:trPr>
         <w:tc>
           <w:tcPr>
@@ -3876,7 +4041,7 @@
           <w:color w:val="1A1A1A"/>
           <w:sz w:val="21"/>
         </w:rPr>
-        <w:t>Dans « Commandes », ouvre chaque commande de la liste (tu n'auras peut-être pas besoin de toutes les lignes) :</w:t>
+        <w:t>Dans « Commandes », ouvre la commande de chaque bon de préparation de ta fiche :</w:t>
       </w:r>
     </w:p>
     <w:tbl>
@@ -3887,15 +4052,15 @@
         <w:tblLook w:firstColumn="1" w:firstRow="1" w:lastColumn="0" w:lastRow="0" w:noHBand="0" w:noVBand="1" w:val="04A0"/>
       </w:tblPr>
       <w:tblGrid>
-        <w:gridCol w:w="2154"/>
-        <w:gridCol w:w="2494"/>
-        <w:gridCol w:w="2835"/>
-        <w:gridCol w:w="2154"/>
+        <w:gridCol w:w="2268"/>
+        <w:gridCol w:w="2381"/>
+        <w:gridCol w:w="2721"/>
+        <w:gridCol w:w="2268"/>
       </w:tblGrid>
       <w:tr>
         <w:tc>
           <w:tcPr>
-            <w:tcW w:type="dxa" w:w="2154"/>
+            <w:tcW w:type="dxa" w:w="2268"/>
             <w:shd w:fill="E8E8E8"/>
           </w:tcPr>
           <w:p>
@@ -3909,13 +4074,33 @@
                 <w:color w:val="111111"/>
                 <w:sz w:val="20"/>
               </w:rPr>
-              <w:t>N° de commande</w:t>
+              <w:t>Bon de ta fiche (BP-…)</w:t>
             </w:r>
           </w:p>
         </w:tc>
         <w:tc>
           <w:tcPr>
-            <w:tcW w:type="dxa" w:w="2494"/>
+            <w:tcW w:type="dxa" w:w="2381"/>
+            <w:shd w:fill="E8E8E8"/>
+          </w:tcPr>
+          <w:p>
+            <w:pPr>
+              <w:keepNext/>
+              <w:spacing w:after="0"/>
+            </w:pPr>
+            <w:r>
+              <w:rPr>
+                <w:b/>
+                <w:color w:val="111111"/>
+                <w:sz w:val="20"/>
+              </w:rPr>
+              <w:t>Commande (CMD-…)</w:t>
+            </w:r>
+          </w:p>
+        </w:tc>
+        <w:tc>
+          <w:tcPr>
+            <w:tcW w:type="dxa" w:w="2721"/>
             <w:shd w:fill="E8E8E8"/>
           </w:tcPr>
           <w:p>
@@ -3935,7 +4120,7 @@
         </w:tc>
         <w:tc>
           <w:tcPr>
-            <w:tcW w:type="dxa" w:w="2835"/>
+            <w:tcW w:type="dxa" w:w="2268"/>
             <w:shd w:fill="E8E8E8"/>
           </w:tcPr>
           <w:p>
@@ -3949,13 +4134,294 @@
                 <w:color w:val="111111"/>
                 <w:sz w:val="20"/>
               </w:rPr>
-              <w:t>Écouteurs dans la commande ?</w:t>
+              <w:t>Écouteurs commandés</w:t>
             </w:r>
           </w:p>
         </w:tc>
-        <w:tc>
-          <w:tcPr>
-            <w:tcW w:type="dxa" w:w="2154"/>
+      </w:tr>
+      <w:tr>
+        <w:trPr>
+          <w:trHeight w:val="454"/>
+        </w:trPr>
+        <w:tc>
+          <w:tcPr>
+            <w:tcW w:type="dxa" w:w="2268"/>
+          </w:tcPr>
+          <w:p/>
+        </w:tc>
+        <w:tc>
+          <w:tcPr>
+            <w:tcW w:type="dxa" w:w="2381"/>
+          </w:tcPr>
+          <w:p/>
+        </w:tc>
+        <w:tc>
+          <w:tcPr>
+            <w:tcW w:type="dxa" w:w="2721"/>
+          </w:tcPr>
+          <w:p/>
+        </w:tc>
+        <w:tc>
+          <w:tcPr>
+            <w:tcW w:type="dxa" w:w="2268"/>
+          </w:tcPr>
+          <w:p/>
+        </w:tc>
+      </w:tr>
+      <w:tr>
+        <w:trPr>
+          <w:trHeight w:val="454"/>
+        </w:trPr>
+        <w:tc>
+          <w:tcPr>
+            <w:tcW w:type="dxa" w:w="2268"/>
+          </w:tcPr>
+          <w:p/>
+        </w:tc>
+        <w:tc>
+          <w:tcPr>
+            <w:tcW w:type="dxa" w:w="2381"/>
+          </w:tcPr>
+          <w:p/>
+        </w:tc>
+        <w:tc>
+          <w:tcPr>
+            <w:tcW w:type="dxa" w:w="2721"/>
+          </w:tcPr>
+          <w:p/>
+        </w:tc>
+        <w:tc>
+          <w:tcPr>
+            <w:tcW w:type="dxa" w:w="2268"/>
+          </w:tcPr>
+          <w:p/>
+        </w:tc>
+      </w:tr>
+      <w:tr>
+        <w:trPr>
+          <w:trHeight w:val="454"/>
+        </w:trPr>
+        <w:tc>
+          <w:tcPr>
+            <w:tcW w:type="dxa" w:w="2268"/>
+          </w:tcPr>
+          <w:p/>
+        </w:tc>
+        <w:tc>
+          <w:tcPr>
+            <w:tcW w:type="dxa" w:w="2381"/>
+          </w:tcPr>
+          <w:p/>
+        </w:tc>
+        <w:tc>
+          <w:tcPr>
+            <w:tcW w:type="dxa" w:w="2721"/>
+          </w:tcPr>
+          <w:p/>
+        </w:tc>
+        <w:tc>
+          <w:tcPr>
+            <w:tcW w:type="dxa" w:w="2268"/>
+          </w:tcPr>
+          <w:p/>
+        </w:tc>
+      </w:tr>
+      <w:tr>
+        <w:trPr>
+          <w:trHeight w:val="454"/>
+        </w:trPr>
+        <w:tc>
+          <w:tcPr>
+            <w:tcW w:type="dxa" w:w="2268"/>
+          </w:tcPr>
+          <w:p/>
+        </w:tc>
+        <w:tc>
+          <w:tcPr>
+            <w:tcW w:type="dxa" w:w="2381"/>
+          </w:tcPr>
+          <w:p/>
+        </w:tc>
+        <w:tc>
+          <w:tcPr>
+            <w:tcW w:type="dxa" w:w="2721"/>
+          </w:tcPr>
+          <w:p/>
+        </w:tc>
+        <w:tc>
+          <w:tcPr>
+            <w:tcW w:type="dxa" w:w="2268"/>
+          </w:tcPr>
+          <w:p/>
+        </w:tc>
+      </w:tr>
+      <w:tr>
+        <w:trPr>
+          <w:trHeight w:val="454"/>
+        </w:trPr>
+        <w:tc>
+          <w:tcPr>
+            <w:tcW w:type="dxa" w:w="2268"/>
+          </w:tcPr>
+          <w:p/>
+        </w:tc>
+        <w:tc>
+          <w:tcPr>
+            <w:tcW w:type="dxa" w:w="2381"/>
+          </w:tcPr>
+          <w:p/>
+        </w:tc>
+        <w:tc>
+          <w:tcPr>
+            <w:tcW w:type="dxa" w:w="2721"/>
+          </w:tcPr>
+          <w:p/>
+        </w:tc>
+        <w:tc>
+          <w:tcPr>
+            <w:tcW w:type="dxa" w:w="2268"/>
+          </w:tcPr>
+          <w:p/>
+        </w:tc>
+      </w:tr>
+      <w:tr>
+        <w:trPr>
+          <w:trHeight w:val="454"/>
+        </w:trPr>
+        <w:tc>
+          <w:tcPr>
+            <w:tcW w:type="dxa" w:w="2268"/>
+          </w:tcPr>
+          <w:p/>
+        </w:tc>
+        <w:tc>
+          <w:tcPr>
+            <w:tcW w:type="dxa" w:w="2381"/>
+          </w:tcPr>
+          <w:p/>
+        </w:tc>
+        <w:tc>
+          <w:tcPr>
+            <w:tcW w:type="dxa" w:w="2721"/>
+          </w:tcPr>
+          <w:p/>
+        </w:tc>
+        <w:tc>
+          <w:tcPr>
+            <w:tcW w:type="dxa" w:w="2268"/>
+          </w:tcPr>
+          <w:p/>
+        </w:tc>
+      </w:tr>
+      <w:tr>
+        <w:trPr>
+          <w:trHeight w:val="454"/>
+        </w:trPr>
+        <w:tc>
+          <w:tcPr>
+            <w:tcW w:type="dxa" w:w="2268"/>
+          </w:tcPr>
+          <w:p/>
+        </w:tc>
+        <w:tc>
+          <w:tcPr>
+            <w:tcW w:type="dxa" w:w="2381"/>
+          </w:tcPr>
+          <w:p/>
+        </w:tc>
+        <w:tc>
+          <w:tcPr>
+            <w:tcW w:type="dxa" w:w="2721"/>
+          </w:tcPr>
+          <w:p/>
+        </w:tc>
+        <w:tc>
+          <w:tcPr>
+            <w:tcW w:type="dxa" w:w="2268"/>
+          </w:tcPr>
+          <w:p/>
+        </w:tc>
+      </w:tr>
+      <w:tr>
+        <w:trPr>
+          <w:trHeight w:val="454"/>
+        </w:trPr>
+        <w:tc>
+          <w:tcPr>
+            <w:tcW w:type="dxa" w:w="2268"/>
+          </w:tcPr>
+          <w:p/>
+        </w:tc>
+        <w:tc>
+          <w:tcPr>
+            <w:tcW w:type="dxa" w:w="2381"/>
+          </w:tcPr>
+          <w:p/>
+        </w:tc>
+        <w:tc>
+          <w:tcPr>
+            <w:tcW w:type="dxa" w:w="2721"/>
+          </w:tcPr>
+          <w:p/>
+        </w:tc>
+        <w:tc>
+          <w:tcPr>
+            <w:tcW w:type="dxa" w:w="2268"/>
+          </w:tcPr>
+          <w:p/>
+        </w:tc>
+      </w:tr>
+      <w:tr>
+        <w:trPr>
+          <w:trHeight w:val="454"/>
+        </w:trPr>
+        <w:tc>
+          <w:tcPr>
+            <w:tcW w:type="dxa" w:w="2268"/>
+          </w:tcPr>
+          <w:p/>
+        </w:tc>
+        <w:tc>
+          <w:tcPr>
+            <w:tcW w:type="dxa" w:w="2381"/>
+          </w:tcPr>
+          <w:p/>
+        </w:tc>
+        <w:tc>
+          <w:tcPr>
+            <w:tcW w:type="dxa" w:w="2721"/>
+          </w:tcPr>
+          <w:p/>
+        </w:tc>
+        <w:tc>
+          <w:tcPr>
+            <w:tcW w:type="dxa" w:w="2268"/>
+          </w:tcPr>
+          <w:p/>
+        </w:tc>
+      </w:tr>
+    </w:tbl>
+    <w:p>
+      <w:pPr>
+        <w:keepNext/>
+        <w:spacing w:after="40"/>
+      </w:pPr>
+    </w:p>
+    <w:tbl>
+      <w:tblPr>
+        <w:tblStyle w:val="TableGrid"/>
+        <w:tblW w:type="auto" w:w="0"/>
+        <w:tblLayout w:type="fixed"/>
+        <w:tblLook w:firstColumn="1" w:firstRow="1" w:lastColumn="0" w:lastRow="0" w:noHBand="0" w:noVBand="1" w:val="04A0"/>
+      </w:tblPr>
+      <w:tblGrid>
+        <w:gridCol w:w="5896"/>
+        <w:gridCol w:w="3742"/>
+      </w:tblGrid>
+      <w:tr>
+        <w:tc>
+          <w:tcPr>
+            <w:tcW w:type="dxa" w:w="5896"/>
             <w:shd w:fill="E8E8E8"/>
           </w:tcPr>
           <w:p>
@@ -3969,280 +4435,13 @@
                 <w:color w:val="111111"/>
                 <w:sz w:val="20"/>
               </w:rPr>
-              <w:t>Quantité d'écouteurs</w:t>
+              <w:t>Question</w:t>
             </w:r>
           </w:p>
         </w:tc>
-      </w:tr>
-      <w:tr>
-        <w:trPr>
-          <w:trHeight w:val="482"/>
-        </w:trPr>
-        <w:tc>
-          <w:tcPr>
-            <w:tcW w:type="dxa" w:w="2154"/>
-          </w:tcPr>
-          <w:p/>
-        </w:tc>
-        <w:tc>
-          <w:tcPr>
-            <w:tcW w:type="dxa" w:w="2494"/>
-          </w:tcPr>
-          <w:p/>
-        </w:tc>
-        <w:tc>
-          <w:tcPr>
-            <w:tcW w:type="dxa" w:w="2835"/>
-          </w:tcPr>
-          <w:p/>
-        </w:tc>
-        <w:tc>
-          <w:tcPr>
-            <w:tcW w:type="dxa" w:w="2154"/>
-          </w:tcPr>
-          <w:p/>
-        </w:tc>
-      </w:tr>
-      <w:tr>
-        <w:trPr>
-          <w:trHeight w:val="482"/>
-        </w:trPr>
-        <w:tc>
-          <w:tcPr>
-            <w:tcW w:type="dxa" w:w="2154"/>
-          </w:tcPr>
-          <w:p/>
-        </w:tc>
-        <w:tc>
-          <w:tcPr>
-            <w:tcW w:type="dxa" w:w="2494"/>
-          </w:tcPr>
-          <w:p/>
-        </w:tc>
-        <w:tc>
-          <w:tcPr>
-            <w:tcW w:type="dxa" w:w="2835"/>
-          </w:tcPr>
-          <w:p/>
-        </w:tc>
-        <w:tc>
-          <w:tcPr>
-            <w:tcW w:type="dxa" w:w="2154"/>
-          </w:tcPr>
-          <w:p/>
-        </w:tc>
-      </w:tr>
-      <w:tr>
-        <w:trPr>
-          <w:trHeight w:val="482"/>
-        </w:trPr>
-        <w:tc>
-          <w:tcPr>
-            <w:tcW w:type="dxa" w:w="2154"/>
-          </w:tcPr>
-          <w:p/>
-        </w:tc>
-        <w:tc>
-          <w:tcPr>
-            <w:tcW w:type="dxa" w:w="2494"/>
-          </w:tcPr>
-          <w:p/>
-        </w:tc>
-        <w:tc>
-          <w:tcPr>
-            <w:tcW w:type="dxa" w:w="2835"/>
-          </w:tcPr>
-          <w:p/>
-        </w:tc>
-        <w:tc>
-          <w:tcPr>
-            <w:tcW w:type="dxa" w:w="2154"/>
-          </w:tcPr>
-          <w:p/>
-        </w:tc>
-      </w:tr>
-      <w:tr>
-        <w:trPr>
-          <w:trHeight w:val="482"/>
-        </w:trPr>
-        <w:tc>
-          <w:tcPr>
-            <w:tcW w:type="dxa" w:w="2154"/>
-          </w:tcPr>
-          <w:p/>
-        </w:tc>
-        <w:tc>
-          <w:tcPr>
-            <w:tcW w:type="dxa" w:w="2494"/>
-          </w:tcPr>
-          <w:p/>
-        </w:tc>
-        <w:tc>
-          <w:tcPr>
-            <w:tcW w:type="dxa" w:w="2835"/>
-          </w:tcPr>
-          <w:p/>
-        </w:tc>
-        <w:tc>
-          <w:tcPr>
-            <w:tcW w:type="dxa" w:w="2154"/>
-          </w:tcPr>
-          <w:p/>
-        </w:tc>
-      </w:tr>
-      <w:tr>
-        <w:trPr>
-          <w:trHeight w:val="482"/>
-        </w:trPr>
-        <w:tc>
-          <w:tcPr>
-            <w:tcW w:type="dxa" w:w="2154"/>
-          </w:tcPr>
-          <w:p/>
-        </w:tc>
-        <w:tc>
-          <w:tcPr>
-            <w:tcW w:type="dxa" w:w="2494"/>
-          </w:tcPr>
-          <w:p/>
-        </w:tc>
-        <w:tc>
-          <w:tcPr>
-            <w:tcW w:type="dxa" w:w="2835"/>
-          </w:tcPr>
-          <w:p/>
-        </w:tc>
-        <w:tc>
-          <w:tcPr>
-            <w:tcW w:type="dxa" w:w="2154"/>
-          </w:tcPr>
-          <w:p/>
-        </w:tc>
-      </w:tr>
-      <w:tr>
-        <w:trPr>
-          <w:trHeight w:val="482"/>
-        </w:trPr>
-        <w:tc>
-          <w:tcPr>
-            <w:tcW w:type="dxa" w:w="2154"/>
-          </w:tcPr>
-          <w:p/>
-        </w:tc>
-        <w:tc>
-          <w:tcPr>
-            <w:tcW w:type="dxa" w:w="2494"/>
-          </w:tcPr>
-          <w:p/>
-        </w:tc>
-        <w:tc>
-          <w:tcPr>
-            <w:tcW w:type="dxa" w:w="2835"/>
-          </w:tcPr>
-          <w:p/>
-        </w:tc>
-        <w:tc>
-          <w:tcPr>
-            <w:tcW w:type="dxa" w:w="2154"/>
-          </w:tcPr>
-          <w:p/>
-        </w:tc>
-      </w:tr>
-      <w:tr>
-        <w:trPr>
-          <w:trHeight w:val="482"/>
-        </w:trPr>
-        <w:tc>
-          <w:tcPr>
-            <w:tcW w:type="dxa" w:w="2154"/>
-          </w:tcPr>
-          <w:p/>
-        </w:tc>
-        <w:tc>
-          <w:tcPr>
-            <w:tcW w:type="dxa" w:w="2494"/>
-          </w:tcPr>
-          <w:p/>
-        </w:tc>
-        <w:tc>
-          <w:tcPr>
-            <w:tcW w:type="dxa" w:w="2835"/>
-          </w:tcPr>
-          <w:p/>
-        </w:tc>
-        <w:tc>
-          <w:tcPr>
-            <w:tcW w:type="dxa" w:w="2154"/>
-          </w:tcPr>
-          <w:p/>
-        </w:tc>
-      </w:tr>
-      <w:tr>
-        <w:trPr>
-          <w:trHeight w:val="482"/>
-        </w:trPr>
-        <w:tc>
-          <w:tcPr>
-            <w:tcW w:type="dxa" w:w="2154"/>
-          </w:tcPr>
-          <w:p/>
-        </w:tc>
-        <w:tc>
-          <w:tcPr>
-            <w:tcW w:type="dxa" w:w="2494"/>
-          </w:tcPr>
-          <w:p/>
-        </w:tc>
-        <w:tc>
-          <w:tcPr>
-            <w:tcW w:type="dxa" w:w="2835"/>
-          </w:tcPr>
-          <w:p/>
-        </w:tc>
-        <w:tc>
-          <w:tcPr>
-            <w:tcW w:type="dxa" w:w="2154"/>
-          </w:tcPr>
-          <w:p/>
-        </w:tc>
-      </w:tr>
-    </w:tbl>
-    <w:p>
-      <w:pPr>
-        <w:spacing w:after="40"/>
-      </w:pPr>
-    </w:p>
-    <w:p>
-      <w:pPr>
-        <w:keepNext/>
-        <w:spacing w:before="0" w:after="80"/>
-      </w:pPr>
-      <w:r>
-        <w:rPr>
-          <w:b/>
-          <w:color w:val="1A1A1A"/>
-          <w:sz w:val="21"/>
-        </w:rPr>
-        <w:t>Dans la « Messagerie », les services ont écrit à Nadia au sujet de deux mouvements de ta fiche :</w:t>
-      </w:r>
-    </w:p>
-    <w:tbl>
-      <w:tblPr>
-        <w:tblStyle w:val="TableGrid"/>
-        <w:tblW w:type="auto" w:w="0"/>
-        <w:tblLayout w:type="fixed"/>
-        <w:tblLook w:firstColumn="1" w:firstRow="1" w:lastColumn="0" w:lastRow="0" w:noHBand="0" w:noVBand="1" w:val="04A0"/>
-      </w:tblPr>
-      <w:tblGrid>
-        <w:gridCol w:w="2154"/>
-        <w:gridCol w:w="2268"/>
-        <w:gridCol w:w="3628"/>
-        <w:gridCol w:w="1587"/>
-      </w:tblGrid>
-      <w:tr>
-        <w:tc>
-          <w:tcPr>
-            <w:tcW w:type="dxa" w:w="2154"/>
+        <w:tc>
+          <w:tcPr>
+            <w:tcW w:type="dxa" w:w="3742"/>
             <w:shd w:fill="E8E8E8"/>
           </w:tcPr>
           <w:p>
@@ -4256,13 +4455,166 @@
                 <w:color w:val="111111"/>
                 <w:sz w:val="20"/>
               </w:rPr>
-              <w:t>Document reçu (n°)</w:t>
+              <w:t>Ta réponse</w:t>
             </w:r>
           </w:p>
         </w:tc>
-        <w:tc>
-          <w:tcPr>
-            <w:tcW w:type="dxa" w:w="2268"/>
+      </w:tr>
+      <w:tr>
+        <w:trPr>
+          <w:trHeight w:val="510"/>
+          <w:cantSplit/>
+        </w:trPr>
+        <w:tc>
+          <w:tcPr>
+            <w:tcW w:type="dxa" w:w="5896"/>
+          </w:tcPr>
+          <w:p>
+            <w:pPr>
+              <w:spacing w:after="0"/>
+            </w:pPr>
+            <w:r>
+              <w:rPr>
+                <w:sz w:val="20"/>
+              </w:rPr>
+              <w:t>Dans la liste « Commandes », quel est le statut de la commande de la cliente ?</w:t>
+            </w:r>
+          </w:p>
+        </w:tc>
+        <w:tc>
+          <w:tcPr>
+            <w:tcW w:type="dxa" w:w="3742"/>
+          </w:tcPr>
+          <w:p/>
+        </w:tc>
+      </w:tr>
+    </w:tbl>
+    <w:p>
+      <w:pPr>
+        <w:keepNext/>
+        <w:spacing w:after="0" w:line="60" w:lineRule="exact"/>
+      </w:pPr>
+      <w:r>
+        <w:rPr>
+          <w:sz w:val="10"/>
+        </w:rPr>
+      </w:r>
+    </w:p>
+    <w:tbl>
+      <w:tblPr>
+        <w:tblStyle w:val="TableGrid"/>
+        <w:tblW w:type="auto" w:w="0"/>
+        <w:tblLook w:firstColumn="1" w:firstRow="1" w:lastColumn="0" w:lastRow="0" w:noHBand="0" w:noVBand="1" w:val="04A0"/>
+      </w:tblPr>
+      <w:tblGrid>
+        <w:gridCol w:w="10086"/>
+      </w:tblGrid>
+      <w:tr>
+        <w:trPr>
+          <w:cantSplit/>
+          <w:trHeight w:val="1474"/>
+        </w:trPr>
+        <w:tc>
+          <w:tcPr>
+            <w:tcW w:type="dxa" w:w="10086"/>
+            <w:shd w:fill="FAFAFA"/>
+          </w:tcPr>
+          <w:p>
+            <w:pPr>
+              <w:spacing w:after="80"/>
+            </w:pPr>
+            <w:r>
+              <w:rPr>
+                <w:b/>
+                <w:sz w:val="21"/>
+              </w:rPr>
+              <w:t>Cette commande a-t-elle fait bouger le stock d'écouteurs ? Justifie avec ce que tu as vu à l'écran.</w:t>
+            </w:r>
+          </w:p>
+          <w:p>
+            <w:pPr>
+              <w:spacing w:before="0" w:after="80"/>
+            </w:pPr>
+            <w:r>
+              <w:rPr>
+                <w:sz w:val="22"/>
+              </w:rPr>
+            </w:r>
+          </w:p>
+          <w:p>
+            <w:pPr>
+              <w:spacing w:before="0" w:after="80"/>
+            </w:pPr>
+            <w:r>
+              <w:rPr>
+                <w:sz w:val="22"/>
+              </w:rPr>
+            </w:r>
+          </w:p>
+        </w:tc>
+      </w:tr>
+    </w:tbl>
+    <w:p>
+      <w:pPr>
+        <w:spacing w:after="0" w:line="60" w:lineRule="exact"/>
+      </w:pPr>
+      <w:r>
+        <w:rPr>
+          <w:sz w:val="10"/>
+        </w:rPr>
+      </w:r>
+    </w:p>
+    <w:p>
+      <w:pPr>
+        <w:keepNext/>
+        <w:spacing w:before="40" w:after="80"/>
+      </w:pPr>
+      <w:r>
+        <w:rPr>
+          <w:b/>
+          <w:color w:val="1A1A1A"/>
+          <w:sz w:val="21"/>
+        </w:rPr>
+        <w:t>Dans la « Messagerie », deux services t'ont écrit au sujet de deux mouvements de ta fiche :</w:t>
+      </w:r>
+    </w:p>
+    <w:tbl>
+      <w:tblPr>
+        <w:tblStyle w:val="TableGrid"/>
+        <w:tblW w:type="auto" w:w="0"/>
+        <w:tblLayout w:type="fixed"/>
+        <w:tblLook w:firstColumn="1" w:firstRow="1" w:lastColumn="0" w:lastRow="0" w:noHBand="0" w:noVBand="1" w:val="04A0"/>
+      </w:tblPr>
+      <w:tblGrid>
+        <w:gridCol w:w="2041"/>
+        <w:gridCol w:w="2154"/>
+        <w:gridCol w:w="3855"/>
+        <w:gridCol w:w="1587"/>
+      </w:tblGrid>
+      <w:tr>
+        <w:tc>
+          <w:tcPr>
+            <w:tcW w:type="dxa" w:w="2041"/>
+            <w:shd w:fill="E8E8E8"/>
+          </w:tcPr>
+          <w:p>
+            <w:pPr>
+              <w:keepNext/>
+              <w:spacing w:after="0"/>
+            </w:pPr>
+            <w:r>
+              <w:rPr>
+                <w:b/>
+                <w:color w:val="111111"/>
+                <w:sz w:val="20"/>
+              </w:rPr>
+              <w:t>Document (n°)</w:t>
+            </w:r>
+          </w:p>
+        </w:tc>
+        <w:tc>
+          <w:tcPr>
+            <w:tcW w:type="dxa" w:w="2154"/>
             <w:shd w:fill="E8E8E8"/>
           </w:tcPr>
           <w:p>
@@ -4282,7 +4634,7 @@
         </w:tc>
         <w:tc>
           <w:tcPr>
-            <w:tcW w:type="dxa" w:w="3628"/>
+            <w:tcW w:type="dxa" w:w="3855"/>
             <w:shd w:fill="E8E8E8"/>
           </w:tcPr>
           <w:p>
@@ -4323,23 +4675,23 @@
       </w:tr>
       <w:tr>
         <w:trPr>
-          <w:trHeight w:val="567"/>
+          <w:trHeight w:val="539"/>
         </w:trPr>
         <w:tc>
           <w:tcPr>
+            <w:tcW w:type="dxa" w:w="2041"/>
+          </w:tcPr>
+          <w:p/>
+        </w:tc>
+        <w:tc>
+          <w:tcPr>
             <w:tcW w:type="dxa" w:w="2154"/>
           </w:tcPr>
           <w:p/>
         </w:tc>
         <w:tc>
           <w:tcPr>
-            <w:tcW w:type="dxa" w:w="2268"/>
-          </w:tcPr>
-          <w:p/>
-        </w:tc>
-        <w:tc>
-          <w:tcPr>
-            <w:tcW w:type="dxa" w:w="3628"/>
+            <w:tcW w:type="dxa" w:w="3855"/>
           </w:tcPr>
           <w:p/>
         </w:tc>
@@ -4352,23 +4704,23 @@
       </w:tr>
       <w:tr>
         <w:trPr>
-          <w:trHeight w:val="567"/>
+          <w:trHeight w:val="539"/>
         </w:trPr>
         <w:tc>
           <w:tcPr>
+            <w:tcW w:type="dxa" w:w="2041"/>
+          </w:tcPr>
+          <w:p/>
+        </w:tc>
+        <w:tc>
+          <w:tcPr>
             <w:tcW w:type="dxa" w:w="2154"/>
           </w:tcPr>
           <w:p/>
         </w:tc>
         <w:tc>
           <w:tcPr>
-            <w:tcW w:type="dxa" w:w="2268"/>
-          </w:tcPr>
-          <w:p/>
-        </w:tc>
-        <w:tc>
-          <w:tcPr>
-            <w:tcW w:type="dxa" w:w="3628"/>
+            <w:tcW w:type="dxa" w:w="3855"/>
           </w:tcPr>
           <w:p/>
         </w:tc>
@@ -4381,23 +4733,23 @@
       </w:tr>
       <w:tr>
         <w:trPr>
-          <w:trHeight w:val="567"/>
+          <w:trHeight w:val="539"/>
         </w:trPr>
         <w:tc>
           <w:tcPr>
+            <w:tcW w:type="dxa" w:w="2041"/>
+          </w:tcPr>
+          <w:p/>
+        </w:tc>
+        <w:tc>
+          <w:tcPr>
             <w:tcW w:type="dxa" w:w="2154"/>
           </w:tcPr>
           <w:p/>
         </w:tc>
         <w:tc>
           <w:tcPr>
-            <w:tcW w:type="dxa" w:w="2268"/>
-          </w:tcPr>
-          <w:p/>
-        </w:tc>
-        <w:tc>
-          <w:tcPr>
-            <w:tcW w:type="dxa" w:w="3628"/>
+            <w:tcW w:type="dxa" w:w="3855"/>
           </w:tcPr>
           <w:p/>
         </w:tc>
@@ -4508,10 +4860,1115 @@
           </w:p>
         </w:tc>
       </w:tr>
+    </w:tbl>
+    <w:p>
+      <w:pPr>
+        <w:spacing w:after="0" w:line="60" w:lineRule="exact"/>
+      </w:pPr>
+      <w:r>
+        <w:rPr>
+          <w:sz w:val="10"/>
+        </w:rPr>
+      </w:r>
+    </w:p>
+    <w:p>
+      <w:pPr>
+        <w:keepNext/>
+        <w:pageBreakBefore/>
+        <w:spacing w:before="0" w:after="0"/>
+      </w:pPr>
+      <w:r>
+        <w:rPr>
+          <w:rFonts w:ascii="Consolas" w:hAnsi="Consolas"/>
+          <w:b/>
+          <w:color w:val="595959"/>
+          <w:sz w:val="19"/>
+        </w:rPr>
+        <w:t>ÉTAPE 6</w:t>
+      </w:r>
+    </w:p>
+    <w:p>
+      <w:pPr>
+        <w:keepNext/>
+        <w:spacing w:before="40" w:after="160"/>
+      </w:pPr>
+      <w:r>
+        <w:rPr>
+          <w:b/>
+          <w:color w:val="111111"/>
+          <w:sz w:val="30"/>
+        </w:rPr>
+        <w:t>Comparer chaque document à son mouvement</w:t>
+      </w:r>
+    </w:p>
+    <w:p>
+      <w:pPr>
+        <w:spacing w:before="0" w:after="120"/>
+      </w:pPr>
+      <w:r>
+        <w:rPr>
+          <w:b w:val="0"/>
+          <w:color w:val="1A1A1A"/>
+          <w:sz w:val="22"/>
+        </w:rPr>
+        <w:t>Le système ne sait que ce qu'on lui a saisi. Un document dit ce qui s'est passé dans l'entrepôt ; le mouvement dit ce qui a été saisi. Les deux doivent dire la même quantité.</w:t>
+      </w:r>
+    </w:p>
+    <w:p>
+      <w:pPr>
+        <w:keepNext/>
+        <w:spacing w:after="80"/>
+        <w:ind w:left="454" w:hanging="454"/>
+      </w:pPr>
+      <w:r>
+        <w:rPr>
+          <w:b/>
+          <w:color w:val="111111"/>
+          <w:sz w:val="22"/>
+        </w:rPr>
+        <w:t xml:space="preserve">1.  </w:t>
+      </w:r>
+      <w:r>
+        <w:rPr>
+          <w:sz w:val="22"/>
+        </w:rPr>
+        <w:t>Pour chaque ligne de ta fiche, relis le document que tu as retrouvé à l'étape 5.</w:t>
+      </w:r>
+    </w:p>
+    <w:p>
+      <w:pPr>
+        <w:keepNext/>
+        <w:spacing w:after="80"/>
+        <w:ind w:left="454" w:hanging="454"/>
+      </w:pPr>
+      <w:r>
+        <w:rPr>
+          <w:b/>
+          <w:color w:val="111111"/>
+          <w:sz w:val="22"/>
+        </w:rPr>
+        <w:t xml:space="preserve">2.  </w:t>
+      </w:r>
+      <w:r>
+        <w:rPr>
+          <w:sz w:val="22"/>
+        </w:rPr>
+        <w:t>Note la quantité écrite sur le document (reçue, préparée, retournée ou constatée), puis la quantité du mouvement (ta fiche).</w:t>
+      </w:r>
+    </w:p>
+    <w:p>
+      <w:pPr>
+        <w:keepNext/>
+        <w:spacing w:after="80"/>
+        <w:ind w:left="454" w:hanging="454"/>
+      </w:pPr>
+      <w:r>
+        <w:rPr>
+          <w:b/>
+          <w:color w:val="111111"/>
+          <w:sz w:val="22"/>
+        </w:rPr>
+        <w:t xml:space="preserve">3.  </w:t>
+      </w:r>
+      <w:r>
+        <w:rPr>
+          <w:sz w:val="22"/>
+        </w:rPr>
+        <w:t>Écris « oui » si les deux quantités sont les mêmes, « non » sinon.</w:t>
+      </w:r>
+    </w:p>
+    <w:tbl>
+      <w:tblPr>
+        <w:tblStyle w:val="TableGrid"/>
+        <w:tblW w:type="auto" w:w="0"/>
+        <w:tblLayout w:type="fixed"/>
+        <w:tblLook w:firstColumn="1" w:firstRow="1" w:lastColumn="0" w:lastRow="0" w:noHBand="0" w:noVBand="1" w:val="04A0"/>
+      </w:tblPr>
+      <w:tblGrid>
+        <w:gridCol w:w="2494"/>
+        <w:gridCol w:w="3061"/>
+        <w:gridCol w:w="2494"/>
+        <w:gridCol w:w="1587"/>
+      </w:tblGrid>
+      <w:tr>
+        <w:tc>
+          <w:tcPr>
+            <w:tcW w:type="dxa" w:w="2494"/>
+            <w:shd w:fill="E8E8E8"/>
+          </w:tcPr>
+          <w:p>
+            <w:pPr>
+              <w:keepNext/>
+              <w:spacing w:after="0"/>
+            </w:pPr>
+            <w:r>
+              <w:rPr>
+                <w:b/>
+                <w:color w:val="111111"/>
+                <w:sz w:val="20"/>
+              </w:rPr>
+              <w:t>Document</w:t>
+            </w:r>
+          </w:p>
+        </w:tc>
+        <w:tc>
+          <w:tcPr>
+            <w:tcW w:type="dxa" w:w="3061"/>
+            <w:shd w:fill="E8E8E8"/>
+          </w:tcPr>
+          <w:p>
+            <w:pPr>
+              <w:keepNext/>
+              <w:spacing w:after="0"/>
+            </w:pPr>
+            <w:r>
+              <w:rPr>
+                <w:b/>
+                <w:color w:val="111111"/>
+                <w:sz w:val="20"/>
+              </w:rPr>
+              <w:t>Quantité écrite sur le document</w:t>
+            </w:r>
+          </w:p>
+        </w:tc>
+        <w:tc>
+          <w:tcPr>
+            <w:tcW w:type="dxa" w:w="2494"/>
+            <w:shd w:fill="E8E8E8"/>
+          </w:tcPr>
+          <w:p>
+            <w:pPr>
+              <w:keepNext/>
+              <w:spacing w:after="0"/>
+            </w:pPr>
+            <w:r>
+              <w:rPr>
+                <w:b/>
+                <w:color w:val="111111"/>
+                <w:sz w:val="20"/>
+              </w:rPr>
+              <w:t>Quantité du mouvement</w:t>
+            </w:r>
+          </w:p>
+        </w:tc>
+        <w:tc>
+          <w:tcPr>
+            <w:tcW w:type="dxa" w:w="1587"/>
+            <w:shd w:fill="E8E8E8"/>
+          </w:tcPr>
+          <w:p>
+            <w:pPr>
+              <w:keepNext/>
+              <w:spacing w:after="0"/>
+            </w:pPr>
+            <w:r>
+              <w:rPr>
+                <w:b/>
+                <w:color w:val="111111"/>
+                <w:sz w:val="20"/>
+              </w:rPr>
+              <w:t>Pareil ?</w:t>
+            </w:r>
+          </w:p>
+        </w:tc>
+      </w:tr>
+      <w:tr>
+        <w:trPr>
+          <w:trHeight w:val="454"/>
+        </w:trPr>
+        <w:tc>
+          <w:tcPr>
+            <w:tcW w:type="dxa" w:w="2494"/>
+          </w:tcPr>
+          <w:p/>
+        </w:tc>
+        <w:tc>
+          <w:tcPr>
+            <w:tcW w:type="dxa" w:w="3061"/>
+          </w:tcPr>
+          <w:p/>
+        </w:tc>
+        <w:tc>
+          <w:tcPr>
+            <w:tcW w:type="dxa" w:w="2494"/>
+          </w:tcPr>
+          <w:p/>
+        </w:tc>
+        <w:tc>
+          <w:tcPr>
+            <w:tcW w:type="dxa" w:w="1587"/>
+          </w:tcPr>
+          <w:p/>
+        </w:tc>
+      </w:tr>
+      <w:tr>
+        <w:trPr>
+          <w:trHeight w:val="454"/>
+        </w:trPr>
+        <w:tc>
+          <w:tcPr>
+            <w:tcW w:type="dxa" w:w="2494"/>
+          </w:tcPr>
+          <w:p/>
+        </w:tc>
+        <w:tc>
+          <w:tcPr>
+            <w:tcW w:type="dxa" w:w="3061"/>
+          </w:tcPr>
+          <w:p/>
+        </w:tc>
+        <w:tc>
+          <w:tcPr>
+            <w:tcW w:type="dxa" w:w="2494"/>
+          </w:tcPr>
+          <w:p/>
+        </w:tc>
+        <w:tc>
+          <w:tcPr>
+            <w:tcW w:type="dxa" w:w="1587"/>
+          </w:tcPr>
+          <w:p/>
+        </w:tc>
+      </w:tr>
+      <w:tr>
+        <w:trPr>
+          <w:trHeight w:val="454"/>
+        </w:trPr>
+        <w:tc>
+          <w:tcPr>
+            <w:tcW w:type="dxa" w:w="2494"/>
+          </w:tcPr>
+          <w:p/>
+        </w:tc>
+        <w:tc>
+          <w:tcPr>
+            <w:tcW w:type="dxa" w:w="3061"/>
+          </w:tcPr>
+          <w:p/>
+        </w:tc>
+        <w:tc>
+          <w:tcPr>
+            <w:tcW w:type="dxa" w:w="2494"/>
+          </w:tcPr>
+          <w:p/>
+        </w:tc>
+        <w:tc>
+          <w:tcPr>
+            <w:tcW w:type="dxa" w:w="1587"/>
+          </w:tcPr>
+          <w:p/>
+        </w:tc>
+      </w:tr>
+      <w:tr>
+        <w:trPr>
+          <w:trHeight w:val="454"/>
+        </w:trPr>
+        <w:tc>
+          <w:tcPr>
+            <w:tcW w:type="dxa" w:w="2494"/>
+          </w:tcPr>
+          <w:p/>
+        </w:tc>
+        <w:tc>
+          <w:tcPr>
+            <w:tcW w:type="dxa" w:w="3061"/>
+          </w:tcPr>
+          <w:p/>
+        </w:tc>
+        <w:tc>
+          <w:tcPr>
+            <w:tcW w:type="dxa" w:w="2494"/>
+          </w:tcPr>
+          <w:p/>
+        </w:tc>
+        <w:tc>
+          <w:tcPr>
+            <w:tcW w:type="dxa" w:w="1587"/>
+          </w:tcPr>
+          <w:p/>
+        </w:tc>
+      </w:tr>
+      <w:tr>
+        <w:trPr>
+          <w:trHeight w:val="454"/>
+        </w:trPr>
+        <w:tc>
+          <w:tcPr>
+            <w:tcW w:type="dxa" w:w="2494"/>
+          </w:tcPr>
+          <w:p/>
+        </w:tc>
+        <w:tc>
+          <w:tcPr>
+            <w:tcW w:type="dxa" w:w="3061"/>
+          </w:tcPr>
+          <w:p/>
+        </w:tc>
+        <w:tc>
+          <w:tcPr>
+            <w:tcW w:type="dxa" w:w="2494"/>
+          </w:tcPr>
+          <w:p/>
+        </w:tc>
+        <w:tc>
+          <w:tcPr>
+            <w:tcW w:type="dxa" w:w="1587"/>
+          </w:tcPr>
+          <w:p/>
+        </w:tc>
+      </w:tr>
+      <w:tr>
+        <w:trPr>
+          <w:trHeight w:val="454"/>
+        </w:trPr>
+        <w:tc>
+          <w:tcPr>
+            <w:tcW w:type="dxa" w:w="2494"/>
+          </w:tcPr>
+          <w:p/>
+        </w:tc>
+        <w:tc>
+          <w:tcPr>
+            <w:tcW w:type="dxa" w:w="3061"/>
+          </w:tcPr>
+          <w:p/>
+        </w:tc>
+        <w:tc>
+          <w:tcPr>
+            <w:tcW w:type="dxa" w:w="2494"/>
+          </w:tcPr>
+          <w:p/>
+        </w:tc>
+        <w:tc>
+          <w:tcPr>
+            <w:tcW w:type="dxa" w:w="1587"/>
+          </w:tcPr>
+          <w:p/>
+        </w:tc>
+      </w:tr>
+      <w:tr>
+        <w:trPr>
+          <w:trHeight w:val="454"/>
+        </w:trPr>
+        <w:tc>
+          <w:tcPr>
+            <w:tcW w:type="dxa" w:w="2494"/>
+          </w:tcPr>
+          <w:p/>
+        </w:tc>
+        <w:tc>
+          <w:tcPr>
+            <w:tcW w:type="dxa" w:w="3061"/>
+          </w:tcPr>
+          <w:p/>
+        </w:tc>
+        <w:tc>
+          <w:tcPr>
+            <w:tcW w:type="dxa" w:w="2494"/>
+          </w:tcPr>
+          <w:p/>
+        </w:tc>
+        <w:tc>
+          <w:tcPr>
+            <w:tcW w:type="dxa" w:w="1587"/>
+          </w:tcPr>
+          <w:p/>
+        </w:tc>
+      </w:tr>
+      <w:tr>
+        <w:trPr>
+          <w:trHeight w:val="454"/>
+        </w:trPr>
+        <w:tc>
+          <w:tcPr>
+            <w:tcW w:type="dxa" w:w="2494"/>
+          </w:tcPr>
+          <w:p/>
+        </w:tc>
+        <w:tc>
+          <w:tcPr>
+            <w:tcW w:type="dxa" w:w="3061"/>
+          </w:tcPr>
+          <w:p/>
+        </w:tc>
+        <w:tc>
+          <w:tcPr>
+            <w:tcW w:type="dxa" w:w="2494"/>
+          </w:tcPr>
+          <w:p/>
+        </w:tc>
+        <w:tc>
+          <w:tcPr>
+            <w:tcW w:type="dxa" w:w="1587"/>
+          </w:tcPr>
+          <w:p/>
+        </w:tc>
+      </w:tr>
+      <w:tr>
+        <w:trPr>
+          <w:trHeight w:val="454"/>
+        </w:trPr>
+        <w:tc>
+          <w:tcPr>
+            <w:tcW w:type="dxa" w:w="2494"/>
+          </w:tcPr>
+          <w:p/>
+        </w:tc>
+        <w:tc>
+          <w:tcPr>
+            <w:tcW w:type="dxa" w:w="3061"/>
+          </w:tcPr>
+          <w:p/>
+        </w:tc>
+        <w:tc>
+          <w:tcPr>
+            <w:tcW w:type="dxa" w:w="2494"/>
+          </w:tcPr>
+          <w:p/>
+        </w:tc>
+        <w:tc>
+          <w:tcPr>
+            <w:tcW w:type="dxa" w:w="1587"/>
+          </w:tcPr>
+          <w:p/>
+        </w:tc>
+      </w:tr>
+      <w:tr>
+        <w:trPr>
+          <w:trHeight w:val="454"/>
+        </w:trPr>
+        <w:tc>
+          <w:tcPr>
+            <w:tcW w:type="dxa" w:w="2494"/>
+          </w:tcPr>
+          <w:p/>
+        </w:tc>
+        <w:tc>
+          <w:tcPr>
+            <w:tcW w:type="dxa" w:w="3061"/>
+          </w:tcPr>
+          <w:p/>
+        </w:tc>
+        <w:tc>
+          <w:tcPr>
+            <w:tcW w:type="dxa" w:w="2494"/>
+          </w:tcPr>
+          <w:p/>
+        </w:tc>
+        <w:tc>
+          <w:tcPr>
+            <w:tcW w:type="dxa" w:w="1587"/>
+          </w:tcPr>
+          <w:p/>
+        </w:tc>
+      </w:tr>
+      <w:tr>
+        <w:trPr>
+          <w:trHeight w:val="454"/>
+        </w:trPr>
+        <w:tc>
+          <w:tcPr>
+            <w:tcW w:type="dxa" w:w="2494"/>
+          </w:tcPr>
+          <w:p/>
+        </w:tc>
+        <w:tc>
+          <w:tcPr>
+            <w:tcW w:type="dxa" w:w="3061"/>
+          </w:tcPr>
+          <w:p/>
+        </w:tc>
+        <w:tc>
+          <w:tcPr>
+            <w:tcW w:type="dxa" w:w="2494"/>
+          </w:tcPr>
+          <w:p/>
+        </w:tc>
+        <w:tc>
+          <w:tcPr>
+            <w:tcW w:type="dxa" w:w="1587"/>
+          </w:tcPr>
+          <w:p/>
+        </w:tc>
+      </w:tr>
+      <w:tr>
+        <w:trPr>
+          <w:trHeight w:val="454"/>
+        </w:trPr>
+        <w:tc>
+          <w:tcPr>
+            <w:tcW w:type="dxa" w:w="2494"/>
+          </w:tcPr>
+          <w:p/>
+        </w:tc>
+        <w:tc>
+          <w:tcPr>
+            <w:tcW w:type="dxa" w:w="3061"/>
+          </w:tcPr>
+          <w:p/>
+        </w:tc>
+        <w:tc>
+          <w:tcPr>
+            <w:tcW w:type="dxa" w:w="2494"/>
+          </w:tcPr>
+          <w:p/>
+        </w:tc>
+        <w:tc>
+          <w:tcPr>
+            <w:tcW w:type="dxa" w:w="1587"/>
+          </w:tcPr>
+          <w:p/>
+        </w:tc>
+      </w:tr>
+    </w:tbl>
+    <w:p>
+      <w:pPr>
+        <w:keepNext/>
+        <w:spacing w:after="40"/>
+      </w:pPr>
+    </w:p>
+    <w:tbl>
+      <w:tblPr>
+        <w:tblStyle w:val="TableGrid"/>
+        <w:tblW w:type="auto" w:w="0"/>
+        <w:tblLayout w:type="fixed"/>
+        <w:tblLook w:firstColumn="1" w:firstRow="1" w:lastColumn="0" w:lastRow="0" w:noHBand="0" w:noVBand="1" w:val="04A0"/>
+      </w:tblPr>
+      <w:tblGrid>
+        <w:gridCol w:w="5896"/>
+        <w:gridCol w:w="3742"/>
+      </w:tblGrid>
+      <w:tr>
+        <w:tc>
+          <w:tcPr>
+            <w:tcW w:type="dxa" w:w="5896"/>
+            <w:shd w:fill="E8E8E8"/>
+          </w:tcPr>
+          <w:p>
+            <w:pPr>
+              <w:keepNext/>
+              <w:spacing w:after="0"/>
+            </w:pPr>
+            <w:r>
+              <w:rPr>
+                <w:b/>
+                <w:color w:val="111111"/>
+                <w:sz w:val="20"/>
+              </w:rPr>
+              <w:t>Question</w:t>
+            </w:r>
+          </w:p>
+        </w:tc>
+        <w:tc>
+          <w:tcPr>
+            <w:tcW w:type="dxa" w:w="3742"/>
+            <w:shd w:fill="E8E8E8"/>
+          </w:tcPr>
+          <w:p>
+            <w:pPr>
+              <w:keepNext/>
+              <w:spacing w:after="0"/>
+            </w:pPr>
+            <w:r>
+              <w:rPr>
+                <w:b/>
+                <w:color w:val="111111"/>
+                <w:sz w:val="20"/>
+              </w:rPr>
+              <w:t>Ta réponse</w:t>
+            </w:r>
+          </w:p>
+        </w:tc>
+      </w:tr>
+      <w:tr>
+        <w:trPr>
+          <w:trHeight w:val="510"/>
+          <w:cantSplit/>
+        </w:trPr>
+        <w:tc>
+          <w:tcPr>
+            <w:tcW w:type="dxa" w:w="5896"/>
+          </w:tcPr>
+          <w:p>
+            <w:pPr>
+              <w:spacing w:after="0"/>
+            </w:pPr>
+            <w:r>
+              <w:rPr>
+                <w:sz w:val="20"/>
+              </w:rPr>
+              <w:t>Quel document ne dit pas la même chose que son mouvement ?</w:t>
+            </w:r>
+          </w:p>
+        </w:tc>
+        <w:tc>
+          <w:tcPr>
+            <w:tcW w:type="dxa" w:w="3742"/>
+          </w:tcPr>
+          <w:p/>
+        </w:tc>
+      </w:tr>
+      <w:tr>
+        <w:trPr>
+          <w:trHeight w:val="510"/>
+          <w:cantSplit/>
+        </w:trPr>
+        <w:tc>
+          <w:tcPr>
+            <w:tcW w:type="dxa" w:w="5896"/>
+          </w:tcPr>
+          <w:p>
+            <w:pPr>
+              <w:spacing w:after="0"/>
+            </w:pPr>
+            <w:r>
+              <w:rPr>
+                <w:sz w:val="20"/>
+              </w:rPr>
+              <w:t>Écart entre le document et le mouvement (en nombre d'écouteurs)</w:t>
+            </w:r>
+          </w:p>
+        </w:tc>
+        <w:tc>
+          <w:tcPr>
+            <w:tcW w:type="dxa" w:w="3742"/>
+          </w:tcPr>
+          <w:p/>
+        </w:tc>
+      </w:tr>
+    </w:tbl>
+    <w:p>
+      <w:pPr>
+        <w:keepNext/>
+        <w:spacing w:after="0" w:line="60" w:lineRule="exact"/>
+      </w:pPr>
+      <w:r>
+        <w:rPr>
+          <w:sz w:val="10"/>
+        </w:rPr>
+      </w:r>
+    </w:p>
+    <w:tbl>
+      <w:tblPr>
+        <w:tblStyle w:val="TableGrid"/>
+        <w:tblW w:type="auto" w:w="0"/>
+        <w:jc w:val="left"/>
+        <w:tblLook w:firstColumn="1" w:firstRow="1" w:lastColumn="0" w:lastRow="0" w:noHBand="0" w:noVBand="1" w:val="04A0"/>
+      </w:tblPr>
+      <w:tblGrid>
+        <w:gridCol w:w="10086"/>
+      </w:tblGrid>
+      <w:tr>
+        <w:tc>
+          <w:tcPr>
+            <w:tcW w:type="dxa" w:w="10086"/>
+            <w:shd w:fill="F2F2F2"/>
+          </w:tcPr>
+          <w:p>
+            <w:pPr>
+              <w:pageBreakBefore/>
+              <w:spacing w:after="0"/>
+            </w:pPr>
+            <w:r>
+              <w:rPr>
+                <w:b/>
+                <w:color w:val="111111"/>
+                <w:sz w:val="20"/>
+              </w:rPr>
+              <w:t xml:space="preserve">Une seconde preuve : </w:t>
+            </w:r>
+            <w:r>
+              <w:rPr>
+                <w:sz w:val="20"/>
+              </w:rPr>
+              <w:t>un bon de préparation affiche, dans la colonne « Stock trouvé », ce que le préparateur a vu dans le rayon juste avant de prendre les articles. Compare-le au stock du système juste avant la sortie (le « Stock après » de la ligne du dessus, sur ta fiche).</w:t>
+            </w:r>
+          </w:p>
+        </w:tc>
+      </w:tr>
+    </w:tbl>
+    <w:p>
+      <w:pPr>
+        <w:keepNext/>
+        <w:spacing w:after="40"/>
+      </w:pPr>
+    </w:p>
+    <w:tbl>
+      <w:tblPr>
+        <w:tblStyle w:val="TableGrid"/>
+        <w:tblW w:type="auto" w:w="0"/>
+        <w:tblLayout w:type="fixed"/>
+        <w:tblLook w:firstColumn="1" w:firstRow="1" w:lastColumn="0" w:lastRow="0" w:noHBand="0" w:noVBand="1" w:val="04A0"/>
+      </w:tblPr>
+      <w:tblGrid>
+        <w:gridCol w:w="2381"/>
+        <w:gridCol w:w="2948"/>
+        <w:gridCol w:w="2721"/>
+        <w:gridCol w:w="1587"/>
+      </w:tblGrid>
+      <w:tr>
+        <w:tc>
+          <w:tcPr>
+            <w:tcW w:type="dxa" w:w="2381"/>
+            <w:shd w:fill="E8E8E8"/>
+          </w:tcPr>
+          <w:p>
+            <w:pPr>
+              <w:keepNext/>
+              <w:spacing w:after="0"/>
+            </w:pPr>
+            <w:r>
+              <w:rPr>
+                <w:b/>
+                <w:color w:val="111111"/>
+                <w:sz w:val="20"/>
+              </w:rPr>
+              <w:t>Commande</w:t>
+            </w:r>
+          </w:p>
+        </w:tc>
+        <w:tc>
+          <w:tcPr>
+            <w:tcW w:type="dxa" w:w="2948"/>
+            <w:shd w:fill="E8E8E8"/>
+          </w:tcPr>
+          <w:p>
+            <w:pPr>
+              <w:keepNext/>
+              <w:spacing w:after="0"/>
+            </w:pPr>
+            <w:r>
+              <w:rPr>
+                <w:b/>
+                <w:color w:val="111111"/>
+                <w:sz w:val="20"/>
+              </w:rPr>
+              <w:t>Stock trouvé (bon de préparation)</w:t>
+            </w:r>
+          </w:p>
+        </w:tc>
+        <w:tc>
+          <w:tcPr>
+            <w:tcW w:type="dxa" w:w="2721"/>
+            <w:shd w:fill="E8E8E8"/>
+          </w:tcPr>
+          <w:p>
+            <w:pPr>
+              <w:keepNext/>
+              <w:spacing w:after="0"/>
+            </w:pPr>
+            <w:r>
+              <w:rPr>
+                <w:b/>
+                <w:color w:val="111111"/>
+                <w:sz w:val="20"/>
+              </w:rPr>
+              <w:t>Stock du système juste avant</w:t>
+            </w:r>
+          </w:p>
+        </w:tc>
+        <w:tc>
+          <w:tcPr>
+            <w:tcW w:type="dxa" w:w="1587"/>
+            <w:shd w:fill="E8E8E8"/>
+          </w:tcPr>
+          <w:p>
+            <w:pPr>
+              <w:keepNext/>
+              <w:spacing w:after="0"/>
+            </w:pPr>
+            <w:r>
+              <w:rPr>
+                <w:b/>
+                <w:color w:val="111111"/>
+                <w:sz w:val="20"/>
+              </w:rPr>
+              <w:t>Pareil ?</w:t>
+            </w:r>
+          </w:p>
+        </w:tc>
+      </w:tr>
+      <w:tr>
+        <w:trPr>
+          <w:trHeight w:val="454"/>
+        </w:trPr>
+        <w:tc>
+          <w:tcPr>
+            <w:tcW w:type="dxa" w:w="2381"/>
+          </w:tcPr>
+          <w:p/>
+        </w:tc>
+        <w:tc>
+          <w:tcPr>
+            <w:tcW w:type="dxa" w:w="2948"/>
+          </w:tcPr>
+          <w:p/>
+        </w:tc>
+        <w:tc>
+          <w:tcPr>
+            <w:tcW w:type="dxa" w:w="2721"/>
+          </w:tcPr>
+          <w:p/>
+        </w:tc>
+        <w:tc>
+          <w:tcPr>
+            <w:tcW w:type="dxa" w:w="1587"/>
+          </w:tcPr>
+          <w:p/>
+        </w:tc>
+      </w:tr>
+      <w:tr>
+        <w:trPr>
+          <w:trHeight w:val="454"/>
+        </w:trPr>
+        <w:tc>
+          <w:tcPr>
+            <w:tcW w:type="dxa" w:w="2381"/>
+          </w:tcPr>
+          <w:p/>
+        </w:tc>
+        <w:tc>
+          <w:tcPr>
+            <w:tcW w:type="dxa" w:w="2948"/>
+          </w:tcPr>
+          <w:p/>
+        </w:tc>
+        <w:tc>
+          <w:tcPr>
+            <w:tcW w:type="dxa" w:w="2721"/>
+          </w:tcPr>
+          <w:p/>
+        </w:tc>
+        <w:tc>
+          <w:tcPr>
+            <w:tcW w:type="dxa" w:w="1587"/>
+          </w:tcPr>
+          <w:p/>
+        </w:tc>
+      </w:tr>
+      <w:tr>
+        <w:trPr>
+          <w:trHeight w:val="454"/>
+        </w:trPr>
+        <w:tc>
+          <w:tcPr>
+            <w:tcW w:type="dxa" w:w="2381"/>
+          </w:tcPr>
+          <w:p/>
+        </w:tc>
+        <w:tc>
+          <w:tcPr>
+            <w:tcW w:type="dxa" w:w="2948"/>
+          </w:tcPr>
+          <w:p/>
+        </w:tc>
+        <w:tc>
+          <w:tcPr>
+            <w:tcW w:type="dxa" w:w="2721"/>
+          </w:tcPr>
+          <w:p/>
+        </w:tc>
+        <w:tc>
+          <w:tcPr>
+            <w:tcW w:type="dxa" w:w="1587"/>
+          </w:tcPr>
+          <w:p/>
+        </w:tc>
+      </w:tr>
+      <w:tr>
+        <w:trPr>
+          <w:trHeight w:val="454"/>
+        </w:trPr>
+        <w:tc>
+          <w:tcPr>
+            <w:tcW w:type="dxa" w:w="2381"/>
+          </w:tcPr>
+          <w:p/>
+        </w:tc>
+        <w:tc>
+          <w:tcPr>
+            <w:tcW w:type="dxa" w:w="2948"/>
+          </w:tcPr>
+          <w:p/>
+        </w:tc>
+        <w:tc>
+          <w:tcPr>
+            <w:tcW w:type="dxa" w:w="2721"/>
+          </w:tcPr>
+          <w:p/>
+        </w:tc>
+        <w:tc>
+          <w:tcPr>
+            <w:tcW w:type="dxa" w:w="1587"/>
+          </w:tcPr>
+          <w:p/>
+        </w:tc>
+      </w:tr>
+      <w:tr>
+        <w:trPr>
+          <w:trHeight w:val="454"/>
+        </w:trPr>
+        <w:tc>
+          <w:tcPr>
+            <w:tcW w:type="dxa" w:w="2381"/>
+          </w:tcPr>
+          <w:p/>
+        </w:tc>
+        <w:tc>
+          <w:tcPr>
+            <w:tcW w:type="dxa" w:w="2948"/>
+          </w:tcPr>
+          <w:p/>
+        </w:tc>
+        <w:tc>
+          <w:tcPr>
+            <w:tcW w:type="dxa" w:w="2721"/>
+          </w:tcPr>
+          <w:p/>
+        </w:tc>
+        <w:tc>
+          <w:tcPr>
+            <w:tcW w:type="dxa" w:w="1587"/>
+          </w:tcPr>
+          <w:p/>
+        </w:tc>
+      </w:tr>
+      <w:tr>
+        <w:trPr>
+          <w:trHeight w:val="454"/>
+        </w:trPr>
+        <w:tc>
+          <w:tcPr>
+            <w:tcW w:type="dxa" w:w="2381"/>
+          </w:tcPr>
+          <w:p/>
+        </w:tc>
+        <w:tc>
+          <w:tcPr>
+            <w:tcW w:type="dxa" w:w="2948"/>
+          </w:tcPr>
+          <w:p/>
+        </w:tc>
+        <w:tc>
+          <w:tcPr>
+            <w:tcW w:type="dxa" w:w="2721"/>
+          </w:tcPr>
+          <w:p/>
+        </w:tc>
+        <w:tc>
+          <w:tcPr>
+            <w:tcW w:type="dxa" w:w="1587"/>
+          </w:tcPr>
+          <w:p/>
+        </w:tc>
+      </w:tr>
+      <w:tr>
+        <w:trPr>
+          <w:trHeight w:val="454"/>
+        </w:trPr>
+        <w:tc>
+          <w:tcPr>
+            <w:tcW w:type="dxa" w:w="2381"/>
+          </w:tcPr>
+          <w:p/>
+        </w:tc>
+        <w:tc>
+          <w:tcPr>
+            <w:tcW w:type="dxa" w:w="2948"/>
+          </w:tcPr>
+          <w:p/>
+        </w:tc>
+        <w:tc>
+          <w:tcPr>
+            <w:tcW w:type="dxa" w:w="2721"/>
+          </w:tcPr>
+          <w:p/>
+        </w:tc>
+        <w:tc>
+          <w:tcPr>
+            <w:tcW w:type="dxa" w:w="1587"/>
+          </w:tcPr>
+          <w:p/>
+        </w:tc>
+      </w:tr>
+      <w:tr>
+        <w:trPr>
+          <w:trHeight w:val="454"/>
+        </w:trPr>
+        <w:tc>
+          <w:tcPr>
+            <w:tcW w:type="dxa" w:w="2381"/>
+          </w:tcPr>
+          <w:p/>
+        </w:tc>
+        <w:tc>
+          <w:tcPr>
+            <w:tcW w:type="dxa" w:w="2948"/>
+          </w:tcPr>
+          <w:p/>
+        </w:tc>
+        <w:tc>
+          <w:tcPr>
+            <w:tcW w:type="dxa" w:w="2721"/>
+          </w:tcPr>
+          <w:p/>
+        </w:tc>
+        <w:tc>
+          <w:tcPr>
+            <w:tcW w:type="dxa" w:w="1587"/>
+          </w:tcPr>
+          <w:p/>
+        </w:tc>
+      </w:tr>
+      <w:tr>
+        <w:trPr>
+          <w:trHeight w:val="454"/>
+        </w:trPr>
+        <w:tc>
+          <w:tcPr>
+            <w:tcW w:type="dxa" w:w="2381"/>
+          </w:tcPr>
+          <w:p/>
+        </w:tc>
+        <w:tc>
+          <w:tcPr>
+            <w:tcW w:type="dxa" w:w="2948"/>
+          </w:tcPr>
+          <w:p/>
+        </w:tc>
+        <w:tc>
+          <w:tcPr>
+            <w:tcW w:type="dxa" w:w="2721"/>
+          </w:tcPr>
+          <w:p/>
+        </w:tc>
+        <w:tc>
+          <w:tcPr>
+            <w:tcW w:type="dxa" w:w="1587"/>
+          </w:tcPr>
+          <w:p/>
+        </w:tc>
+      </w:tr>
+    </w:tbl>
+    <w:p>
+      <w:pPr>
+        <w:keepNext/>
+        <w:spacing w:after="40"/>
+      </w:pPr>
+    </w:p>
+    <w:tbl>
+      <w:tblPr>
+        <w:tblStyle w:val="TableGrid"/>
+        <w:tblW w:type="auto" w:w="0"/>
+        <w:tblLook w:firstColumn="1" w:firstRow="1" w:lastColumn="0" w:lastRow="0" w:noHBand="0" w:noVBand="1" w:val="04A0"/>
+      </w:tblPr>
+      <w:tblGrid>
+        <w:gridCol w:w="10086"/>
+      </w:tblGrid>
       <w:tr>
         <w:trPr>
           <w:cantSplit/>
-          <w:trHeight w:val="2438"/>
+          <w:trHeight w:val="1474"/>
         </w:trPr>
         <w:tc>
           <w:tcPr>
@@ -4527,7 +5984,92 @@
                 <w:b/>
                 <w:sz w:val="21"/>
               </w:rPr>
-              <w:t>Dans une vraie entreprise, que risque-t-on si un mouvement de stock n'a aucun document ?</w:t>
+              <w:t>À partir de quelle commande le « Stock trouvé » ne suit-il plus le stock du système ? Quel mouvement a eu lieu juste avant ?</w:t>
+            </w:r>
+          </w:p>
+          <w:p>
+            <w:pPr>
+              <w:spacing w:before="0" w:after="80"/>
+            </w:pPr>
+            <w:r>
+              <w:rPr>
+                <w:sz w:val="22"/>
+              </w:rPr>
+            </w:r>
+          </w:p>
+          <w:p>
+            <w:pPr>
+              <w:spacing w:before="0" w:after="80"/>
+            </w:pPr>
+            <w:r>
+              <w:rPr>
+                <w:sz w:val="22"/>
+              </w:rPr>
+            </w:r>
+          </w:p>
+        </w:tc>
+      </w:tr>
+    </w:tbl>
+    <w:p>
+      <w:pPr>
+        <w:spacing w:after="0" w:line="60" w:lineRule="exact"/>
+      </w:pPr>
+      <w:r>
+        <w:rPr>
+          <w:sz w:val="10"/>
+        </w:rPr>
+      </w:r>
+    </w:p>
+    <w:p>
+      <w:pPr>
+        <w:keepNext/>
+        <w:spacing w:before="160" w:after="80"/>
+      </w:pPr>
+      <w:r>
+        <w:rPr>
+          <w:b/>
+          <w:color w:val="111111"/>
+          <w:sz w:val="23"/>
+        </w:rPr>
+        <w:t>Pour réfléchir</w:t>
+      </w:r>
+      <w:r>
+        <w:rPr>
+          <w:color w:val="595959"/>
+          <w:sz w:val="19"/>
+        </w:rPr>
+        <w:t xml:space="preserve">   Il n'y a pas une seule bonne réponse : explique la tienne, avec tes mots.</w:t>
+      </w:r>
+    </w:p>
+    <w:tbl>
+      <w:tblPr>
+        <w:tblStyle w:val="TableGrid"/>
+        <w:tblW w:type="auto" w:w="0"/>
+        <w:tblLook w:firstColumn="1" w:firstRow="1" w:lastColumn="0" w:lastRow="0" w:noHBand="0" w:noVBand="1" w:val="04A0"/>
+      </w:tblPr>
+      <w:tblGrid>
+        <w:gridCol w:w="10086"/>
+      </w:tblGrid>
+      <w:tr>
+        <w:trPr>
+          <w:cantSplit/>
+          <w:trHeight w:val="2438"/>
+        </w:trPr>
+        <w:tc>
+          <w:tcPr>
+            <w:tcW w:type="dxa" w:w="10086"/>
+            <w:shd w:fill="FAFAFA"/>
+          </w:tcPr>
+          <w:p>
+            <w:pPr>
+              <w:spacing w:after="80"/>
+            </w:pPr>
+            <w:r>
+              <w:rPr>
+                <w:b/>
+                <w:sz w:val="21"/>
+              </w:rPr>
+              <w:t>Comment as-tu su quel document était faux ?</w:t>
             </w:r>
           </w:p>
           <w:p>
@@ -4596,7 +6138,7 @@
           <w:color w:val="595959"/>
           <w:sz w:val="19"/>
         </w:rPr>
-        <w:t>ÉTAPE 6</w:t>
+        <w:t>ÉTAPE 7</w:t>
       </w:r>
     </w:p>
     <w:p>
@@ -4624,7 +6166,7 @@
           <w:color w:val="1A1A1A"/>
           <w:sz w:val="22"/>
         </w:rPr>
-        <w:t>Tu connais le stock d'aujourd'hui et tout ce qui a bougé depuis l'inventaire. Tu peux donc retrouver le stock du jour de l'inventaire en remontant le temps : ce qui est entré depuis, on le retire ; ce qui est sorti depuis, on le remet.</w:t>
+        <w:t>Tu connais le stock d'aujourd'hui et tout ce qui a bougé depuis l'inventaire. Tu peux retrouver le stock du jour de l'inventaire en remontant le temps : ce qui est entré depuis, on le retire ; ce qui est sorti depuis, on le remet.</w:t>
       </w:r>
     </w:p>
     <w:tbl>
@@ -4659,7 +6201,7 @@
               <w:rPr>
                 <w:sz w:val="20"/>
               </w:rPr>
-              <w:t>à l'endroit, le stock d'aujourd'hui est égal au stock de l'inventaire, plus les entrées, moins les sorties. À l'envers, on fait l'opération contraire.</w:t>
+              <w:t>à l'endroit, stock d'aujourd'hui = stock de l'inventaire + entrées − sorties. À l'envers, on fait l'opération contraire. On calcule avec les mouvements du système, tels qu'ils ont été saisis.</w:t>
             </w:r>
           </w:p>
         </w:tc>
@@ -4688,7 +6230,7 @@
         <w:rPr>
           <w:sz w:val="22"/>
         </w:rPr>
-        <w:t>Additionne la colonne « Entrée » de ta fiche, puis la colonne « Sortie ».</w:t>
+        <w:t>Additionne la colonne « Entrée » de ta fiche, puis la colonne « Sortie ».</w:t>
       </w:r>
     </w:p>
     <w:p>
@@ -4709,7 +6251,7 @@
         <w:rPr>
           <w:sz w:val="22"/>
         </w:rPr>
-        <w:t>Recopie le stock actuel relevé à l'étape 3.</w:t>
+        <w:t>Calcule le stock du dernier inventaire. Écris ton calcul, pas seulement le résultat.</w:t>
       </w:r>
     </w:p>
     <w:p>
@@ -4730,7 +6272,7 @@
         <w:rPr>
           <w:sz w:val="22"/>
         </w:rPr>
-        <w:t>Calcule le stock du dernier inventaire. Écris ton calcul, pas seulement le résultat.</w:t>
+        <w:t>Vérifie à l'endroit : inventaire + entrées − sorties doit redonner le stock actuel.</w:t>
       </w:r>
     </w:p>
     <w:p>
@@ -4751,28 +6293,7 @@
         <w:rPr>
           <w:sz w:val="22"/>
         </w:rPr>
-        <w:t>Vérifie à l'endroit : stock de l'inventaire + entrées − sorties doit redonner le stock actuel.</w:t>
-      </w:r>
-    </w:p>
-    <w:p>
-      <w:pPr>
-        <w:keepNext/>
-        <w:spacing w:after="80"/>
-        <w:ind w:left="454" w:hanging="454"/>
-      </w:pPr>
-      <w:r>
-        <w:rPr>
-          <w:b/>
-          <w:color w:val="111111"/>
-          <w:sz w:val="22"/>
-        </w:rPr>
-        <w:t xml:space="preserve">5.  </w:t>
-      </w:r>
-      <w:r>
-        <w:rPr>
-          <w:sz w:val="22"/>
-        </w:rPr>
-        <w:t>Recopie ton résultat dans la ligne « Inventaire » de ta fiche (case « Stock après »). Vérifie la ligne du dessous : stock de l'inventaire + entrée − sortie doit redonner son « Stock après ».</w:t>
+        <w:t>Recopie ton résultat dans la ligne « Inventaire » de ta fiche (étape 4).</w:t>
       </w:r>
     </w:p>
     <w:tbl>
@@ -4851,7 +6372,7 @@
       </w:tr>
       <w:tr>
         <w:trPr>
-          <w:trHeight w:val="652"/>
+          <w:trHeight w:val="624"/>
         </w:trPr>
         <w:tc>
           <w:tcPr>
@@ -4865,7 +6386,7 @@
               <w:rPr>
                 <w:sz w:val="20"/>
               </w:rPr>
-              <w:t>Total des entrées (colonne « Entrée »)</w:t>
+              <w:t>Total des entrées (colonne « Entrée »)</w:t>
             </w:r>
           </w:p>
         </w:tc>
@@ -4884,7 +6405,7 @@
       </w:tr>
       <w:tr>
         <w:trPr>
-          <w:trHeight w:val="652"/>
+          <w:trHeight w:val="624"/>
         </w:trPr>
         <w:tc>
           <w:tcPr>
@@ -4898,7 +6419,7 @@
               <w:rPr>
                 <w:sz w:val="20"/>
               </w:rPr>
-              <w:t>Total des sorties (colonne « Sortie »)</w:t>
+              <w:t>Total des sorties (colonne « Sortie »)</w:t>
             </w:r>
           </w:p>
         </w:tc>
@@ -4917,7 +6438,7 @@
       </w:tr>
       <w:tr>
         <w:trPr>
-          <w:trHeight w:val="652"/>
+          <w:trHeight w:val="624"/>
         </w:trPr>
         <w:tc>
           <w:tcPr>
@@ -4950,7 +6471,7 @@
       </w:tr>
       <w:tr>
         <w:trPr>
-          <w:trHeight w:val="652"/>
+          <w:trHeight w:val="624"/>
         </w:trPr>
         <w:tc>
           <w:tcPr>
@@ -4983,7 +6504,7 @@
       </w:tr>
       <w:tr>
         <w:trPr>
-          <w:trHeight w:val="652"/>
+          <w:trHeight w:val="624"/>
         </w:trPr>
         <w:tc>
           <w:tcPr>
@@ -5053,7 +6574,7 @@
               <w:rPr>
                 <w:sz w:val="20"/>
               </w:rPr>
-              <w:t>la vérification à l'endroit redonne exactement le stock actuel. Si les deux nombres sont différents, ne cherche pas à arranger le résultat : reprends ta fiche. Vérifie d'abord les totaux, puis l'ordre des lignes, puis les mouvements oubliés.</w:t>
+              <w:t>la vérification à l'endroit redonne exactement le stock actuel. Sinon, n'arrange pas le résultat : reprends tes totaux, puis l'ordre des lignes de ta fiche, puis cherche un mouvement oublié.</w:t>
             </w:r>
           </w:p>
         </w:tc>
@@ -5067,7 +6588,6 @@
     <w:p>
       <w:pPr>
         <w:keepNext/>
-        <w:pageBreakBefore/>
         <w:spacing w:before="160" w:after="80"/>
       </w:pPr>
       <w:r>
@@ -5114,7 +6634,7 @@
                 <w:b/>
                 <w:sz w:val="21"/>
               </w:rPr>
-              <w:t>Si ta vérification n'était pas tombée juste, par où aurais-tu commencé à chercher l'erreur ?</w:t>
+              <w:t>Si le système avait enregistré la quantité écrite sur le document de l'étape 6, qu'est-ce que ça aurait changé pour la cliente ?</w:t>
             </w:r>
           </w:p>
           <w:p>
@@ -5159,70 +6679,6 @@
           </w:p>
         </w:tc>
       </w:tr>
-      <w:tr>
-        <w:trPr>
-          <w:cantSplit/>
-          <w:trHeight w:val="2438"/>
-        </w:trPr>
-        <w:tc>
-          <w:tcPr>
-            <w:tcW w:type="dxa" w:w="10086"/>
-            <w:shd w:fill="FAFAFA"/>
-          </w:tcPr>
-          <w:p>
-            <w:pPr>
-              <w:spacing w:after="80"/>
-            </w:pPr>
-            <w:r>
-              <w:rPr>
-                <w:b/>
-                <w:sz w:val="21"/>
-              </w:rPr>
-              <w:t>Au prochain inventaire, le comptage donne 2 articles de moins que le stock du système. Que ferais-tu en premier ?</w:t>
-            </w:r>
-          </w:p>
-          <w:p>
-            <w:pPr>
-              <w:spacing w:before="0" w:after="80"/>
-            </w:pPr>
-            <w:r>
-              <w:rPr>
-                <w:sz w:val="22"/>
-              </w:rPr>
-            </w:r>
-          </w:p>
-          <w:p>
-            <w:pPr>
-              <w:spacing w:before="0" w:after="80"/>
-            </w:pPr>
-            <w:r>
-              <w:rPr>
-                <w:sz w:val="22"/>
-              </w:rPr>
-            </w:r>
-          </w:p>
-          <w:p>
-            <w:pPr>
-              <w:spacing w:before="0" w:after="80"/>
-            </w:pPr>
-            <w:r>
-              <w:rPr>
-                <w:sz w:val="22"/>
-              </w:rPr>
-            </w:r>
-          </w:p>
-          <w:p>
-            <w:pPr>
-              <w:spacing w:before="0" w:after="80"/>
-            </w:pPr>
-            <w:r>
-              <w:rPr>
-                <w:sz w:val="22"/>
-              </w:rPr>
-            </w:r>
-          </w:p>
-        </w:tc>
-      </w:tr>
     </w:tbl>
     <w:p>
       <w:pPr>
@@ -5247,7 +6703,7 @@
           <w:color w:val="595959"/>
           <w:sz w:val="19"/>
         </w:rPr>
-        <w:t>ÉTAPE 7</w:t>
+        <w:t>ÉTAPE 8</w:t>
       </w:r>
     </w:p>
     <w:p>
@@ -5275,7 +6731,7 @@
           <w:color w:val="1A1A1A"/>
           <w:sz w:val="22"/>
         </w:rPr>
-        <w:t>Tu as tout ce qu'il faut. Il reste à envoyer à Nadia la réponse complète : six lignes, une information par ligne.</w:t>
+        <w:t>Tu as tout ce qu'il faut. Envoie à Nadia la réponse complète : sept lignes, une information par ligne.</w:t>
       </w:r>
     </w:p>
     <w:tbl>
@@ -5289,6 +6745,9 @@
         <w:gridCol w:w="10086"/>
       </w:tblGrid>
       <w:tr>
+        <w:trPr>
+          <w:cantSplit/>
+        </w:trPr>
         <w:tc>
           <w:tcPr>
             <w:tcW w:type="dxa" w:w="10086"/>
@@ -5296,7 +6755,8 @@
           </w:tcPr>
           <w:p>
             <w:pPr>
-              <w:spacing w:after="0"/>
+              <w:keepNext/>
+              <w:spacing w:after="40"/>
             </w:pPr>
             <w:r>
               <w:rPr>
@@ -5304,13 +6764,84 @@
                 <w:color w:val="111111"/>
                 <w:sz w:val="20"/>
               </w:rPr>
-              <w:t xml:space="preserve">À lire AVANT d'écrire : </w:t>
+              <w:t>À lire AVANT d'écrire : le suivi lit tes lignes.</w:t>
             </w:r>
+          </w:p>
+          <w:p>
+            <w:pPr>
+              <w:keepNext/>
+              <w:spacing w:before="0" w:after="40"/>
+              <w:ind w:left="397" w:hanging="227"/>
+            </w:pPr>
             <w:r>
               <w:rPr>
                 <w:sz w:val="20"/>
               </w:rPr>
-              <w:t>le suivi lit tes lignes. Les six intitulés sont déjà écrits dans le champ de réponse : ne les modifie pas, écris ta réponse à la suite, sur la même ligne. Écris les nombres en chiffres (« 15 » et non « quinze »). Sur la ligne du stock actuel, un seul nombre. Sur la ligne du calcul, écris ton calcul, avec le résultat tout à la fin de la ligne. Sur la ligne des commandes, cite seulement celles qui ont des écouteurs. Pour un document, recopie son code en entier (par exemple « CMD-123456 »).</w:t>
+              <w:t>•  ne modifie pas les intitulés déjà écrits : écris ta réponse à la suite, sur la même ligne ;</w:t>
+            </w:r>
+          </w:p>
+          <w:p>
+            <w:pPr>
+              <w:keepNext/>
+              <w:spacing w:before="0" w:after="40"/>
+              <w:ind w:left="397" w:hanging="227"/>
+            </w:pPr>
+            <w:r>
+              <w:rPr>
+                <w:sz w:val="20"/>
+              </w:rPr>
+              <w:t>•  écris les nombres en chiffres (« 15 » et non « quinze ») ;</w:t>
+            </w:r>
+          </w:p>
+          <w:p>
+            <w:pPr>
+              <w:keepNext/>
+              <w:spacing w:before="0" w:after="40"/>
+              <w:ind w:left="397" w:hanging="227"/>
+            </w:pPr>
+            <w:r>
+              <w:rPr>
+                <w:sz w:val="20"/>
+              </w:rPr>
+              <w:t>•  pour un document, recopie son code en entier (par exemple « CMD-123456 ») ;</w:t>
+            </w:r>
+          </w:p>
+          <w:p>
+            <w:pPr>
+              <w:keepNext/>
+              <w:spacing w:before="0" w:after="40"/>
+              <w:ind w:left="397" w:hanging="227"/>
+            </w:pPr>
+            <w:r>
+              <w:rPr>
+                <w:sz w:val="20"/>
+              </w:rPr>
+              <w:t>•  « Commandes » : seulement les commandes qui ont fait sortir des écouteurs du stock ;</w:t>
+            </w:r>
+          </w:p>
+          <w:p>
+            <w:pPr>
+              <w:keepNext/>
+              <w:spacing w:before="0" w:after="40"/>
+              <w:ind w:left="397" w:hanging="227"/>
+            </w:pPr>
+            <w:r>
+              <w:rPr>
+                <w:sz w:val="20"/>
+              </w:rPr>
+              <w:t>•  « Stock au dernier inventaire » : ton calcul, avec le résultat tout à la fin de la ligne ;</w:t>
+            </w:r>
+          </w:p>
+          <w:p>
+            <w:pPr>
+              <w:spacing w:before="0" w:after="0"/>
+              <w:ind w:left="397" w:hanging="227"/>
+            </w:pPr>
+            <w:r>
+              <w:rPr>
+                <w:sz w:val="20"/>
+              </w:rPr>
+              <w:t>•  « Ce qui cloche » : le seul document en cause, et l'écart tout à la fin de la ligne.</w:t>
             </w:r>
           </w:p>
         </w:tc>
@@ -5339,7 +6870,7 @@
         <w:rPr>
           <w:sz w:val="22"/>
         </w:rPr>
-        <w:t>Prépare d'abord tes six lignes dans le tableau ci-dessous.</w:t>
+        <w:t>Prépare tes sept lignes dans le tableau ci-dessous.</w:t>
       </w:r>
     </w:p>
     <w:p>
@@ -5360,7 +6891,7 @@
         <w:rPr>
           <w:sz w:val="22"/>
         </w:rPr>
-        <w:t>Dans « Messagerie », ouvre « Écouteurs ECO-BT-01 : racontez-moi la semaine » et clique sur « Répondre ».</w:t>
+        <w:t>Dans « Messagerie », ouvre le message de Nadia sur les écouteurs et clique sur « Répondre ».</w:t>
       </w:r>
     </w:p>
     <w:p>
@@ -5381,7 +6912,7 @@
         <w:rPr>
           <w:sz w:val="22"/>
         </w:rPr>
-        <w:t>Les six intitulés de Nadia sont déjà écrits dans le champ. Complète chaque ligne avec ta réponse, à la suite de l'intitulé, sans rien effacer. Relis, puis clique sur « Envoyer ».</w:t>
+        <w:t>Complète chaque ligne à la suite de l'intitulé, sans rien effacer. Relis, puis clique sur « Envoyer ».</w:t>
       </w:r>
     </w:p>
     <w:tbl>
@@ -5439,7 +6970,7 @@
       </w:tr>
       <w:tr>
         <w:trPr>
-          <w:trHeight w:val="624"/>
+          <w:trHeight w:val="595"/>
         </w:trPr>
         <w:tc>
           <w:tcPr>
@@ -5466,7 +6997,7 @@
       </w:tr>
       <w:tr>
         <w:trPr>
-          <w:trHeight w:val="624"/>
+          <w:trHeight w:val="595"/>
         </w:trPr>
         <w:tc>
           <w:tcPr>
@@ -5493,7 +7024,7 @@
       </w:tr>
       <w:tr>
         <w:trPr>
-          <w:trHeight w:val="624"/>
+          <w:trHeight w:val="595"/>
         </w:trPr>
         <w:tc>
           <w:tcPr>
@@ -5520,7 +7051,7 @@
       </w:tr>
       <w:tr>
         <w:trPr>
-          <w:trHeight w:val="624"/>
+          <w:trHeight w:val="595"/>
         </w:trPr>
         <w:tc>
           <w:tcPr>
@@ -5547,7 +7078,7 @@
       </w:tr>
       <w:tr>
         <w:trPr>
-          <w:trHeight w:val="624"/>
+          <w:trHeight w:val="595"/>
         </w:trPr>
         <w:tc>
           <w:tcPr>
@@ -5574,7 +7105,7 @@
       </w:tr>
       <w:tr>
         <w:trPr>
-          <w:trHeight w:val="624"/>
+          <w:trHeight w:val="595"/>
         </w:trPr>
         <w:tc>
           <w:tcPr>
@@ -5597,6 +7128,77 @@
             <w:tcW w:type="dxa" w:w="6690"/>
           </w:tcPr>
           <w:p/>
+        </w:tc>
+      </w:tr>
+      <w:tr>
+        <w:trPr>
+          <w:trHeight w:val="595"/>
+        </w:trPr>
+        <w:tc>
+          <w:tcPr>
+            <w:tcW w:type="dxa" w:w="2948"/>
+          </w:tcPr>
+          <w:p>
+            <w:pPr>
+              <w:spacing w:after="0"/>
+            </w:pPr>
+            <w:r>
+              <w:rPr>
+                <w:sz w:val="20"/>
+              </w:rPr>
+              <w:t>Ce qui cloche :</w:t>
+            </w:r>
+          </w:p>
+        </w:tc>
+        <w:tc>
+          <w:tcPr>
+            <w:tcW w:type="dxa" w:w="6690"/>
+          </w:tcPr>
+          <w:p/>
+        </w:tc>
+      </w:tr>
+    </w:tbl>
+    <w:p>
+      <w:pPr>
+        <w:keepNext/>
+        <w:spacing w:after="40"/>
+      </w:pPr>
+    </w:p>
+    <w:tbl>
+      <w:tblPr>
+        <w:tblStyle w:val="TableGrid"/>
+        <w:tblW w:type="auto" w:w="0"/>
+        <w:jc w:val="left"/>
+        <w:tblLook w:firstColumn="1" w:firstRow="1" w:lastColumn="0" w:lastRow="0" w:noHBand="0" w:noVBand="1" w:val="04A0"/>
+      </w:tblPr>
+      <w:tblGrid>
+        <w:gridCol w:w="10086"/>
+      </w:tblGrid>
+      <w:tr>
+        <w:tc>
+          <w:tcPr>
+            <w:tcW w:type="dxa" w:w="10086"/>
+            <w:shd w:fill="F2F2F2"/>
+          </w:tcPr>
+          <w:p>
+            <w:pPr>
+              <w:spacing w:after="0"/>
+            </w:pPr>
+            <w:r>
+              <w:rPr>
+                <w:b/>
+                <w:color w:val="111111"/>
+                <w:sz w:val="20"/>
+              </w:rPr>
+              <w:t xml:space="preserve">Ce que tu dois voir : </w:t>
+            </w:r>
+            <w:r>
+              <w:rPr>
+                <w:sz w:val="20"/>
+              </w:rPr>
+              <w:t>un nouveau message de Nadia arrive dans « Réception ». Il ne dit pas si tes réponses sont justes : c'est ton enseignant qui le voit.</w:t>
+            </w:r>
+          </w:p>
         </w:tc>
       </w:tr>
     </w:tbl>
@@ -5654,71 +7256,7 @@
                 <w:b/>
                 <w:sz w:val="21"/>
               </w:rPr>
-              <w:t>Le stock du système n'est pas un comptage. Qu'est-ce qui pourrait faire que le stock réel du rayon soit différent du chiffre de l'écran ?</w:t>
-            </w:r>
-          </w:p>
-          <w:p>
-            <w:pPr>
-              <w:spacing w:before="0" w:after="80"/>
-            </w:pPr>
-            <w:r>
-              <w:rPr>
-                <w:sz w:val="22"/>
-              </w:rPr>
-            </w:r>
-          </w:p>
-          <w:p>
-            <w:pPr>
-              <w:spacing w:before="0" w:after="80"/>
-            </w:pPr>
-            <w:r>
-              <w:rPr>
-                <w:sz w:val="22"/>
-              </w:rPr>
-            </w:r>
-          </w:p>
-          <w:p>
-            <w:pPr>
-              <w:spacing w:before="0" w:after="80"/>
-            </w:pPr>
-            <w:r>
-              <w:rPr>
-                <w:sz w:val="22"/>
-              </w:rPr>
-            </w:r>
-          </w:p>
-          <w:p>
-            <w:pPr>
-              <w:spacing w:before="0" w:after="80"/>
-            </w:pPr>
-            <w:r>
-              <w:rPr>
-                <w:sz w:val="22"/>
-              </w:rPr>
-            </w:r>
-          </w:p>
-        </w:tc>
-      </w:tr>
-      <w:tr>
-        <w:trPr>
-          <w:cantSplit/>
-          <w:trHeight w:val="2438"/>
-        </w:trPr>
-        <w:tc>
-          <w:tcPr>
-            <w:tcW w:type="dxa" w:w="10086"/>
-            <w:shd w:fill="FAFAFA"/>
-          </w:tcPr>
-          <w:p>
-            <w:pPr>
-              <w:spacing w:after="80"/>
-            </w:pPr>
-            <w:r>
-              <w:rPr>
-                <w:b/>
-                <w:sz w:val="21"/>
-              </w:rPr>
-              <w:t>Relis ta réponse comme si tu étais Nadia : peut-elle comprendre comment tu as trouvé chaque nombre ? Explique.</w:t>
+              <w:t>Si tu étais à la place de Nadia, que ferais-tu maintenant pour que le système dise de nouveau la vérité ?</w:t>
             </w:r>
           </w:p>
           <w:p>

</xml_diff>